<commit_message>
Add Cloud Run deploy, chat agent, dashboard pages, and docs
</commit_message>
<xml_diff>
--- a/Documentacion_Stock_ETL.docx
+++ b/Documentacion_Stock_ETL.docx
@@ -44,7 +44,7 @@
           <w:sz w:val="24"/>
           <w:szCs w:val="24"/>
         </w:rPr>
-        <w:t xml:space="preserve">Sistema automatizado de extracción, almacenamiento y análisis de datos bursátiles</w:t>
+        <w:t xml:space="preserve">Sistema end-to-end: pipeline ETL, data warehouse, API REST, dashboard visual y agente conversacional con IA</w:t>
       </w:r>
     </w:p>
     <w:p>
@@ -82,7 +82,7 @@
           <w:sz w:val="22"/>
           <w:szCs w:val="22"/>
         </w:rPr>
-        <w:t xml:space="preserve">Versión: 1.0</w:t>
+        <w:t xml:space="preserve">Versión: 2.0</w:t>
       </w:r>
     </w:p>
     <w:p>
@@ -137,7 +137,7 @@
         <w:spacing w:after="120"/>
       </w:pPr>
       <w:r>
-        <w:t xml:space="preserve">Este proyecto es un pipeline de datos automatizado que descarga precios bursátiles de 15 empresas (colombianas y estadounidenses) desde Yahoo Finance, los procesa y almacena en un data warehouse en Google BigQuery, y calcula automáticamente métricas financieras como retorno diario, media móvil y volatilidad.</w:t>
+        <w:t xml:space="preserve">Este proyecto es un sistema de datos end-to-end sobre acciones bursátiles: automatiza la ingesta desde Yahoo Finance a un data warehouse en Google BigQuery, expone los datos vía una API REST, los visualiza en un dashboard interactivo, y permite consultarlos en lenguaje natural mediante un agente conversacional con inteligencia artificial.</w:t>
       </w:r>
     </w:p>
     <w:p>
@@ -145,7 +145,7 @@
         <w:spacing w:after="120"/>
       </w:pPr>
       <w:r>
-        <w:t xml:space="preserve">Todo el sistema corre sin intervención humana: una vez configurado, se ejecuta solo todos los días a las 5:00 p.m. hora Colombia, agregando los datos nuevos sin duplicar los existentes. El historial de ejecuciones y todo el código son públicos en GitHub, lo que permite auditoría y reproducibilidad.</w:t>
+        <w:t xml:space="preserve">Cubre 30 tickers (acciones colombianas locales, ADRs y estadounidenses). El pipeline corre automáticamente todos los días a las 5:00 p.m. hora Colombia; una vez configurado, no requiere intervención humana.</w:t>
       </w:r>
     </w:p>
     <w:p>
@@ -153,7 +153,7 @@
         <w:spacing w:after="120"/>
       </w:pPr>
       <w:r>
-        <w:t xml:space="preserve">El sistema es la base para futuras capas de valor: una API REST, un dashboard visual, y un agente conversacional con inteligencia artificial que responda preguntas sobre los datos.</w:t>
+        <w:t xml:space="preserve">Está construido como proyecto de portafolio, con énfasis en buenas prácticas: idempotencia, patrón fact/dimension, prompt caching en el LLM, secretos cifrados, y todo el código versionado en GitHub.</w:t>
       </w:r>
     </w:p>
     <w:p>
@@ -179,7 +179,7 @@
         <w:spacing w:after="120"/>
       </w:pPr>
       <w:r>
-        <w:t xml:space="preserve">Consultar información bursátil actualizada requiere abrir múltiples plataformas, buscar por cada empresa individualmente y hacer cálculos manuales de retornos y tendencias. Este proyecto centraliza esa información en un solo lugar, la mantiene fresca automáticamente y precalcula las métricas más usadas en análisis financiero.</w:t>
+        <w:t xml:space="preserve">Consultar información bursátil actualizada requiere abrir múltiples plataformas, buscar por cada empresa individualmente, hacer cálculos manuales de retornos y tendencias, y no existe una interfaz natural para preguntar en lenguaje humano. Este proyecto centraliza la información, mantiene los datos frescos automáticamente, precalcula métricas financieras clave, y añade una capa conversacional para consultas de negocio sin escribir SQL.</w:t>
       </w:r>
     </w:p>
     <w:p>
@@ -201,7 +201,7 @@
         <w:spacing w:after="60"/>
       </w:pPr>
       <w:r>
-        <w:t xml:space="preserve">Automatización total: cero pasos manuales una vez configurado.</w:t>
+        <w:t xml:space="preserve">Automatización total: cero pasos manuales tras la configuración inicial.</w:t>
       </w:r>
     </w:p>
     <w:p>
@@ -214,7 +214,7 @@
         <w:spacing w:after="60"/>
       </w:pPr>
       <w:r>
-        <w:t xml:space="preserve">Data warehouse profesional (BigQuery): permite queries complejas sobre millones de filas en segundos.</w:t>
+        <w:t xml:space="preserve">Data warehouse profesional (BigQuery): queries sobre millones de filas en segundos.</w:t>
       </w:r>
     </w:p>
     <w:p>
@@ -253,7 +253,20 @@
         <w:spacing w:after="60"/>
       </w:pPr>
       <w:r>
-        <w:t xml:space="preserve">Reproducible y portable: todo el código está versionado; cualquier persona puede desplegar una copia siguiendo el README.</w:t>
+        <w:t xml:space="preserve">Interfaces múltiples: SQL directo, API REST, dashboard visual, o chat con LLM — según lo que sea más cómodo para el usuario.</w:t>
+      </w:r>
+    </w:p>
+    <w:p>
+      <w:pPr>
+        <w:pStyle w:val="ListParagraph"/>
+        <w:numPr>
+          <w:ilvl w:val="0"/>
+          <w:numId w:val="2"/>
+        </w:numPr>
+        <w:spacing w:after="60"/>
+      </w:pPr>
+      <w:r>
+        <w:t xml:space="preserve">Reproducible: todo el código está versionado; cualquier persona puede desplegar una copia siguiendo el README.</w:t>
       </w:r>
     </w:p>
     <w:p>
@@ -270,7 +283,7 @@
         <w:spacing w:after="120"/>
       </w:pPr>
       <w:r>
-        <w:t xml:space="preserve">Diagrama de alto nivel del flujo de datos:</w:t>
+        <w:t xml:space="preserve">Diagrama de alto nivel del sistema completo:</w:t>
       </w:r>
     </w:p>
     <w:p>
@@ -286,79 +299,34 @@
         </w:rPr>
         <w:t xml:space="preserve">  ┌──────────────────┐
   │  Yahoo Finance   │  Fuente pública de precios bursátiles
-  │  (yfinance API)  │
+  │  (yfinance)      │
   └────────┬─────────┘
            │
            ▼
   ┌──────────────────┐
-  │   Python ETL     │  Extract → Transform → Load
-  │ (etl_pipeline.py)│  pandas + google-cloud-bigquery
+  │   Python ETL     │  Extract → Transform → Load (pandas + bigquery)
+  │(etl_pipeline.py) │
   └────────┬─────────┘
-           │
+           │  cron diario 22:00 UTC (5 PM COT)
+           │  ejecutado por GitHub Actions
            ▼
   ┌──────────────────────────────────────────┐
   │            BigQuery (GCP)                 │
-  │  ┌────────────────┐  ┌────────────────┐  │
-  │  │stock_data_dwh  │  │stock_data_intra│  │  Datos crudos
-  │  │  (diario)      │  │day (por hora)  │  │
-  │  └────────────────┘  └────────────────┘  │
-  │  ┌────────────────┐  ┌────────────────┐  │
-  │  │  tickers_dim   │  │ stock_metrics  │  │  Dimensión + derivada
-  │  └────────────────┘  └────────────────┘  │
-  └──────────────────────────────────────────┘
-           ▲
+  │  fact/dim/metrics + 2 vistas enriquecidas │
+  └────────┬─────────────────────────────────┘
            │
+           ▼
   ┌──────────────────┐
-  │  GitHub Actions  │  Cron diario 22:00 UTC (5 PM COT)
-  │  (daily_etl.yml) │
-  └──────────────────┘</w:t>
-      </w:r>
-    </w:p>
-    <w:p>
-      <w:pPr>
-        <w:spacing w:after="120"/>
-      </w:pPr>
-      <w:r>
-        <w:t xml:space="preserve">Fases futuras (no implementadas aún) se conectarían al data warehouse:</w:t>
-      </w:r>
-    </w:p>
-    <w:p>
-      <w:pPr>
-        <w:pStyle w:val="ListParagraph"/>
-        <w:numPr>
-          <w:ilvl w:val="0"/>
-          <w:numId w:val="2"/>
-        </w:numPr>
-        <w:spacing w:after="60"/>
-      </w:pPr>
-      <w:r>
-        <w:t xml:space="preserve">API REST (FastAPI) que expone endpoints consultables.</w:t>
-      </w:r>
-    </w:p>
-    <w:p>
-      <w:pPr>
-        <w:pStyle w:val="ListParagraph"/>
-        <w:numPr>
-          <w:ilvl w:val="0"/>
-          <w:numId w:val="2"/>
-        </w:numPr>
-        <w:spacing w:after="60"/>
-      </w:pPr>
-      <w:r>
-        <w:t xml:space="preserve">Dashboard visual (Streamlit) para explorar los datos gráficamente.</w:t>
-      </w:r>
-    </w:p>
-    <w:p>
-      <w:pPr>
-        <w:pStyle w:val="ListParagraph"/>
-        <w:numPr>
-          <w:ilvl w:val="0"/>
-          <w:numId w:val="2"/>
-        </w:numPr>
-        <w:spacing w:after="60"/>
-      </w:pPr>
-      <w:r>
-        <w:t xml:space="preserve">Agente conversacional (LLM + function calling) que responde preguntas en lenguaje natural.</w:t>
+  │  API REST        │  Endpoints /tickers, /prices, /metrics, ...
+  │  (FastAPI)       │
+  └────────┬─────────┘
+           │
+     ┌─────┴─────────────┐
+     ▼                   ▼
+  ┌────────────┐   ┌──────────────────────┐
+  │  Dashboard  │   │  Agente conversacional│
+  │  (Streamlit)│   │  Claude + tool use   │
+  └────────────┘   └──────────────────────┘</w:t>
       </w:r>
     </w:p>
     <w:p>
@@ -384,7 +352,7 @@
         <w:spacing w:after="120"/>
       </w:pPr>
       <w:r>
-        <w:t xml:space="preserve">Se usa la librería yfinance de Python, que hace scraping oficial de la API de Yahoo Finance. Es gratuita y no requiere API key. Devuelve precios OHLC (Open, High, Low, Close), volumen, dividendos y splits para cualquier ticker soportado.</w:t>
+        <w:t xml:space="preserve">Se usa la librería yfinance de Python, que consume la API pública de Yahoo Finance. Es gratuita y no requiere API key. Devuelve precios OHLC, volumen, dividendos y splits para cualquier ticker soportado.</w:t>
       </w:r>
     </w:p>
     <w:p>
@@ -393,7 +361,7 @@
         <w:spacing w:after="100" w:before="100"/>
       </w:pPr>
       <w:r>
-        <w:t xml:space="preserve">⚠ Limitación: para datos por hora, Yahoo solo entrega los últimos ~730 días de historia. Para datos diarios sí entrega décadas.</w:t>
+        <w:t xml:space="preserve">⚠ Limitación: para intervalo horario (1h), Yahoo solo entrega los últimos ~730 días. Para intervalo diario sí entrega décadas.</w:t>
       </w:r>
     </w:p>
     <w:p>
@@ -402,7 +370,7 @@
         <w:spacing w:after="160" w:before="280"/>
       </w:pPr>
       <w:r>
-        <w:t xml:space="preserve">4.2. Procesamiento: Python</w:t>
+        <w:t xml:space="preserve">4.2. Pipeline ETL: Python</w:t>
       </w:r>
     </w:p>
     <w:p>
@@ -410,59 +378,7 @@
         <w:spacing w:after="120"/>
       </w:pPr>
       <w:r>
-        <w:t xml:space="preserve">Librerías principales:</w:t>
-      </w:r>
-    </w:p>
-    <w:p>
-      <w:pPr>
-        <w:pStyle w:val="ListParagraph"/>
-        <w:numPr>
-          <w:ilvl w:val="0"/>
-          <w:numId w:val="2"/>
-        </w:numPr>
-        <w:spacing w:after="60"/>
-      </w:pPr>
-      <w:r>
-        <w:t xml:space="preserve">pandas: manipulación de DataFrames, limpieza, tipado.</w:t>
-      </w:r>
-    </w:p>
-    <w:p>
-      <w:pPr>
-        <w:pStyle w:val="ListParagraph"/>
-        <w:numPr>
-          <w:ilvl w:val="0"/>
-          <w:numId w:val="2"/>
-        </w:numPr>
-        <w:spacing w:after="60"/>
-      </w:pPr>
-      <w:r>
-        <w:t xml:space="preserve">yfinance: cliente para Yahoo Finance.</w:t>
-      </w:r>
-    </w:p>
-    <w:p>
-      <w:pPr>
-        <w:pStyle w:val="ListParagraph"/>
-        <w:numPr>
-          <w:ilvl w:val="0"/>
-          <w:numId w:val="2"/>
-        </w:numPr>
-        <w:spacing w:after="60"/>
-      </w:pPr>
-      <w:r>
-        <w:t xml:space="preserve">google-cloud-bigquery: cliente oficial de GCP para escribir a BigQuery.</w:t>
-      </w:r>
-    </w:p>
-    <w:p>
-      <w:pPr>
-        <w:pStyle w:val="ListParagraph"/>
-        <w:numPr>
-          <w:ilvl w:val="0"/>
-          <w:numId w:val="2"/>
-        </w:numPr>
-        <w:spacing w:after="60"/>
-      </w:pPr>
-      <w:r>
-        <w:t xml:space="preserve">db-dtypes, pandas-gbq: helpers para conversión pandas ↔ BigQuery.</w:t>
+        <w:t xml:space="preserve">Librerías principales: pandas (manipulación), yfinance (extracción), google-cloud-bigquery (carga), db-dtypes y pandas-gbq (helpers de conversión).</w:t>
       </w:r>
     </w:p>
     <w:p>
@@ -479,59 +395,7 @@
         <w:spacing w:after="120"/>
       </w:pPr>
       <w:r>
-        <w:t xml:space="preserve">BigQuery es el data warehouse serverless de Google Cloud. Ventajas relevantes para este proyecto:</w:t>
-      </w:r>
-    </w:p>
-    <w:p>
-      <w:pPr>
-        <w:pStyle w:val="ListParagraph"/>
-        <w:numPr>
-          <w:ilvl w:val="0"/>
-          <w:numId w:val="2"/>
-        </w:numPr>
-        <w:spacing w:after="60"/>
-      </w:pPr>
-      <w:r>
-        <w:t xml:space="preserve">Escala a millones de filas sin configuración.</w:t>
-      </w:r>
-    </w:p>
-    <w:p>
-      <w:pPr>
-        <w:pStyle w:val="ListParagraph"/>
-        <w:numPr>
-          <w:ilvl w:val="0"/>
-          <w:numId w:val="2"/>
-        </w:numPr>
-        <w:spacing w:after="60"/>
-      </w:pPr>
-      <w:r>
-        <w:t xml:space="preserve">Soporta SQL estándar con window functions (necesario para las métricas).</w:t>
-      </w:r>
-    </w:p>
-    <w:p>
-      <w:pPr>
-        <w:pStyle w:val="ListParagraph"/>
-        <w:numPr>
-          <w:ilvl w:val="0"/>
-          <w:numId w:val="2"/>
-        </w:numPr>
-        <w:spacing w:after="60"/>
-      </w:pPr>
-      <w:r>
-        <w:t xml:space="preserve">Capa gratuita: 10 GB de storage y 1 TB de queries al mes.</w:t>
-      </w:r>
-    </w:p>
-    <w:p>
-      <w:pPr>
-        <w:pStyle w:val="ListParagraph"/>
-        <w:numPr>
-          <w:ilvl w:val="0"/>
-          <w:numId w:val="2"/>
-        </w:numPr>
-        <w:spacing w:after="60"/>
-      </w:pPr>
-      <w:r>
-        <w:t xml:space="preserve">Se paga solo por lo que se usa (no por servidores encendidos).</w:t>
+        <w:t xml:space="preserve">BigQuery es el data warehouse serverless de Google Cloud. Ventajas: escala automática, SQL estándar con window functions, capa gratuita generosa (10 GB storage + 1 TB queries/mes), pago por uso real.</w:t>
       </w:r>
     </w:p>
     <w:p>
@@ -548,59 +412,58 @@
         <w:spacing w:after="120"/>
       </w:pPr>
       <w:r>
-        <w:t xml:space="preserve">GitHub Actions es el sistema de CI/CD y automatización nativo de GitHub. Permite ejecutar código en respuesta a eventos (commits, PRs) o schedules (cron). Aquí se usa un cron diario. Ventajas:</w:t>
-      </w:r>
-    </w:p>
-    <w:p>
-      <w:pPr>
-        <w:pStyle w:val="ListParagraph"/>
-        <w:numPr>
-          <w:ilvl w:val="0"/>
-          <w:numId w:val="2"/>
-        </w:numPr>
-        <w:spacing w:after="60"/>
-      </w:pPr>
-      <w:r>
-        <w:t xml:space="preserve">Gratis: ilimitado para repositorios públicos, 2000 minutos/mes para privados.</w:t>
-      </w:r>
-    </w:p>
-    <w:p>
-      <w:pPr>
-        <w:pStyle w:val="ListParagraph"/>
-        <w:numPr>
-          <w:ilvl w:val="0"/>
-          <w:numId w:val="2"/>
-        </w:numPr>
-        <w:spacing w:after="60"/>
-      </w:pPr>
-      <w:r>
-        <w:t xml:space="preserve">Configuración por archivo YAML versionado con el código.</w:t>
-      </w:r>
-    </w:p>
-    <w:p>
-      <w:pPr>
-        <w:pStyle w:val="ListParagraph"/>
-        <w:numPr>
-          <w:ilvl w:val="0"/>
-          <w:numId w:val="2"/>
-        </w:numPr>
-        <w:spacing w:after="60"/>
-      </w:pPr>
-      <w:r>
-        <w:t xml:space="preserve">Historial de ejecuciones visible públicamente.</w:t>
-      </w:r>
-    </w:p>
-    <w:p>
-      <w:pPr>
-        <w:pStyle w:val="ListParagraph"/>
-        <w:numPr>
-          <w:ilvl w:val="0"/>
-          <w:numId w:val="2"/>
-        </w:numPr>
-        <w:spacing w:after="60"/>
-      </w:pPr>
-      <w:r>
-        <w:t xml:space="preserve">Notificación automática por email si algo falla.</w:t>
+        <w:t xml:space="preserve">Automatización nativa de GitHub. Corre el pipeline diariamente vía cron, y también permite ejecuciones manuales. Gratis para repos públicos, 2000 min/mes para privados. Historial de ejecuciones visible en la pestaña Actions del repo.</w:t>
+      </w:r>
+    </w:p>
+    <w:p>
+      <w:pPr>
+        <w:pStyle w:val="Heading2"/>
+        <w:spacing w:after="160" w:before="280"/>
+      </w:pPr>
+      <w:r>
+        <w:t xml:space="preserve">4.5. API REST: FastAPI</w:t>
+      </w:r>
+    </w:p>
+    <w:p>
+      <w:pPr>
+        <w:spacing w:after="120"/>
+      </w:pPr>
+      <w:r>
+        <w:t xml:space="preserve">Framework Python moderno para APIs. Genera documentación interactiva automática (Swagger UI en /docs), valida tipos con Pydantic, y expone los endpoints que consumen tanto el dashboard como el agente LLM.</w:t>
+      </w:r>
+    </w:p>
+    <w:p>
+      <w:pPr>
+        <w:pStyle w:val="Heading2"/>
+        <w:spacing w:after="160" w:before="280"/>
+      </w:pPr>
+      <w:r>
+        <w:t xml:space="preserve">4.6. Dashboard: Streamlit</w:t>
+      </w:r>
+    </w:p>
+    <w:p>
+      <w:pPr>
+        <w:spacing w:after="120"/>
+      </w:pPr>
+      <w:r>
+        <w:t xml:space="preserve">Framework Python para construir dashboards y aplicaciones web sin escribir HTML/JS. Ideal para prototipar rápido y para portafolios de data. Incluye componentes nativos para gráficos, sliders, selectores y chat.</w:t>
+      </w:r>
+    </w:p>
+    <w:p>
+      <w:pPr>
+        <w:pStyle w:val="Heading2"/>
+        <w:spacing w:after="160" w:before="280"/>
+      </w:pPr>
+      <w:r>
+        <w:t xml:space="preserve">4.7. Agente conversacional: Claude + tool use</w:t>
+      </w:r>
+    </w:p>
+    <w:p>
+      <w:pPr>
+        <w:spacing w:after="120"/>
+      </w:pPr>
+      <w:r>
+        <w:t xml:space="preserve">Uso de la API de Anthropic Claude (modelo claude-sonnet-4-6) con function calling. Cada endpoint de la API se expone al modelo como una tool; el modelo decide cuáles llamar para responder cada pregunta del usuario en lenguaje natural.</w:t>
       </w:r>
     </w:p>
     <w:p>
@@ -617,7 +480,7 @@
         <w:spacing w:after="120"/>
       </w:pPr>
       <w:r>
-        <w:t xml:space="preserve">El sistema usa el patrón de modelado dimensional (fact + dimension) estándar en data warehousing. Cuatro tablas base más dos vistas enriquecidas.</w:t>
+        <w:t xml:space="preserve">El sistema usa el patrón dimensional (fact + dimension) estándar en data warehousing. Cuatro tablas base más dos vistas enriquecidas.</w:t>
       </w:r>
     </w:p>
     <w:p>
@@ -642,14 +505,14 @@
         </w:tblBorders>
       </w:tblPr>
       <w:tblGrid>
-        <w:gridCol w:w="2200"/>
+        <w:gridCol w:w="2400"/>
         <w:gridCol w:w="1600"/>
-        <w:gridCol w:w="5560"/>
+        <w:gridCol w:w="5360"/>
       </w:tblGrid>
       <w:tr>
         <w:tc>
           <w:tcPr>
-            <w:tcW w:type="dxa" w:w="2200"/>
+            <w:tcW w:type="dxa" w:w="2400"/>
             <w:tcBorders>
               <w:top w:val="single" w:color="BFBFBF" w:sz="1"/>
               <w:left w:val="single" w:color="BFBFBF" w:sz="1"/>
@@ -709,7 +572,7 @@
         </w:tc>
         <w:tc>
           <w:tcPr>
-            <w:tcW w:type="dxa" w:w="5560"/>
+            <w:tcW w:type="dxa" w:w="5360"/>
             <w:tcBorders>
               <w:top w:val="single" w:color="BFBFBF" w:sz="1"/>
               <w:left w:val="single" w:color="BFBFBF" w:sz="1"/>
@@ -741,7 +604,7 @@
       <w:tr>
         <w:tc>
           <w:tcPr>
-            <w:tcW w:type="dxa" w:w="2200"/>
+            <w:tcW w:type="dxa" w:w="2400"/>
             <w:tcBorders>
               <w:top w:val="single" w:color="BFBFBF" w:sz="1"/>
               <w:left w:val="single" w:color="BFBFBF" w:sz="1"/>
@@ -801,7 +664,7 @@
         </w:tc>
         <w:tc>
           <w:tcPr>
-            <w:tcW w:type="dxa" w:w="5560"/>
+            <w:tcW w:type="dxa" w:w="5360"/>
             <w:tcBorders>
               <w:top w:val="single" w:color="BFBFBF" w:sz="1"/>
               <w:left w:val="single" w:color="BFBFBF" w:sz="1"/>
@@ -833,7 +696,7 @@
       <w:tr>
         <w:tc>
           <w:tcPr>
-            <w:tcW w:type="dxa" w:w="2200"/>
+            <w:tcW w:type="dxa" w:w="2400"/>
             <w:tcBorders>
               <w:top w:val="single" w:color="BFBFBF" w:sz="1"/>
               <w:left w:val="single" w:color="BFBFBF" w:sz="1"/>
@@ -893,7 +756,7 @@
         </w:tc>
         <w:tc>
           <w:tcPr>
-            <w:tcW w:type="dxa" w:w="5560"/>
+            <w:tcW w:type="dxa" w:w="5360"/>
             <w:tcBorders>
               <w:top w:val="single" w:color="BFBFBF" w:sz="1"/>
               <w:left w:val="single" w:color="BFBFBF" w:sz="1"/>
@@ -925,7 +788,7 @@
       <w:tr>
         <w:tc>
           <w:tcPr>
-            <w:tcW w:type="dxa" w:w="2200"/>
+            <w:tcW w:type="dxa" w:w="2400"/>
             <w:tcBorders>
               <w:top w:val="single" w:color="BFBFBF" w:sz="1"/>
               <w:left w:val="single" w:color="BFBFBF" w:sz="1"/>
@@ -985,31 +848,31 @@
         </w:tc>
         <w:tc>
           <w:tcPr>
-            <w:tcW w:type="dxa" w:w="5560"/>
-            <w:tcBorders>
-              <w:top w:val="single" w:color="BFBFBF" w:sz="1"/>
-              <w:left w:val="single" w:color="BFBFBF" w:sz="1"/>
-              <w:bottom w:val="single" w:color="BFBFBF" w:sz="1"/>
-              <w:right w:val="single" w:color="BFBFBF" w:sz="1"/>
-            </w:tcBorders>
-            <w:shd w:fill="FFFFFF" w:val="clear"/>
-            <w:tcMar>
-              <w:top w:type="dxa" w:w="80"/>
-              <w:left w:type="dxa" w:w="120"/>
-              <w:bottom w:type="dxa" w:w="80"/>
-              <w:right w:type="dxa" w:w="120"/>
-            </w:tcMar>
-          </w:tcPr>
-          <w:p>
-            <w:r>
-              <w:rPr>
-                <w:b w:val="false"/>
-                <w:bCs w:val="false"/>
-                <w:color w:val="000000"/>
-                <w:sz w:val="20"/>
-                <w:szCs w:val="20"/>
-              </w:rPr>
-              <w:t xml:space="preserve">Metadatos por empresa: nombre, industria, bolsa, moneda.</w:t>
+            <w:tcW w:type="dxa" w:w="5360"/>
+            <w:tcBorders>
+              <w:top w:val="single" w:color="BFBFBF" w:sz="1"/>
+              <w:left w:val="single" w:color="BFBFBF" w:sz="1"/>
+              <w:bottom w:val="single" w:color="BFBFBF" w:sz="1"/>
+              <w:right w:val="single" w:color="BFBFBF" w:sz="1"/>
+            </w:tcBorders>
+            <w:shd w:fill="FFFFFF" w:val="clear"/>
+            <w:tcMar>
+              <w:top w:type="dxa" w:w="80"/>
+              <w:left w:type="dxa" w:w="120"/>
+              <w:bottom w:type="dxa" w:w="80"/>
+              <w:right w:type="dxa" w:w="120"/>
+            </w:tcMar>
+          </w:tcPr>
+          <w:p>
+            <w:r>
+              <w:rPr>
+                <w:b w:val="false"/>
+                <w:bCs w:val="false"/>
+                <w:color w:val="000000"/>
+                <w:sz w:val="20"/>
+                <w:szCs w:val="20"/>
+              </w:rPr>
+              <w:t xml:space="preserve">Metadatos por empresa: nombre, industria, bolsa, moneda, parent_brand.</w:t>
             </w:r>
           </w:p>
         </w:tc>
@@ -1017,7 +880,7 @@
       <w:tr>
         <w:tc>
           <w:tcPr>
-            <w:tcW w:type="dxa" w:w="2200"/>
+            <w:tcW w:type="dxa" w:w="2400"/>
             <w:tcBorders>
               <w:top w:val="single" w:color="BFBFBF" w:sz="1"/>
               <w:left w:val="single" w:color="BFBFBF" w:sz="1"/>
@@ -1077,7 +940,7 @@
         </w:tc>
         <w:tc>
           <w:tcPr>
-            <w:tcW w:type="dxa" w:w="5560"/>
+            <w:tcW w:type="dxa" w:w="5360"/>
             <w:tcBorders>
               <w:top w:val="single" w:color="BFBFBF" w:sz="1"/>
               <w:left w:val="single" w:color="BFBFBF" w:sz="1"/>
@@ -1101,7 +964,7 @@
                 <w:sz w:val="20"/>
                 <w:szCs w:val="20"/>
               </w:rPr>
-              <w:t xml:space="preserve">Retorno diario, media móvil de 20 días, volatilidad.</w:t>
+              <w:t xml:space="preserve">Retorno diario, media móvil 20 días, volatilidad.</w:t>
             </w:r>
           </w:p>
         </w:tc>
@@ -1109,7 +972,7 @@
       <w:tr>
         <w:tc>
           <w:tcPr>
-            <w:tcW w:type="dxa" w:w="2200"/>
+            <w:tcW w:type="dxa" w:w="2400"/>
             <w:tcBorders>
               <w:top w:val="single" w:color="BFBFBF" w:sz="1"/>
               <w:left w:val="single" w:color="BFBFBF" w:sz="1"/>
@@ -1169,7 +1032,7 @@
         </w:tc>
         <w:tc>
           <w:tcPr>
-            <w:tcW w:type="dxa" w:w="5560"/>
+            <w:tcW w:type="dxa" w:w="5360"/>
             <w:tcBorders>
               <w:top w:val="single" w:color="BFBFBF" w:sz="1"/>
               <w:left w:val="single" w:color="BFBFBF" w:sz="1"/>
@@ -1201,7 +1064,7 @@
       <w:tr>
         <w:tc>
           <w:tcPr>
-            <w:tcW w:type="dxa" w:w="2200"/>
+            <w:tcW w:type="dxa" w:w="2400"/>
             <w:tcBorders>
               <w:top w:val="single" w:color="BFBFBF" w:sz="1"/>
               <w:left w:val="single" w:color="BFBFBF" w:sz="1"/>
@@ -1261,7 +1124,7 @@
         </w:tc>
         <w:tc>
           <w:tcPr>
-            <w:tcW w:type="dxa" w:w="5560"/>
+            <w:tcW w:type="dxa" w:w="5360"/>
             <w:tcBorders>
               <w:top w:val="single" w:color="BFBFBF" w:sz="1"/>
               <w:left w:val="single" w:color="BFBFBF" w:sz="1"/>
@@ -1305,7 +1168,7 @@
         <w:spacing w:after="120"/>
       </w:pPr>
       <w:r>
-        <w:t xml:space="preserve">Cada fila representa un día de mercado para un ticker específico. Es la tabla más importante del sistema.</w:t>
+        <w:t xml:space="preserve">Cada fila = un día de mercado × un ticker.</w:t>
       </w:r>
     </w:p>
     <w:tbl>
@@ -2260,7 +2123,7 @@
         <w:spacing w:after="120"/>
       </w:pPr>
       <w:r>
-        <w:t xml:space="preserve">Cada fila representa una hora de mercado para un ticker. Sin columnas de dividendos ni splits (esos son eventos de día completo, no de hora).</w:t>
+        <w:t xml:space="preserve">Cada fila = una hora de mercado × un ticker. Sin dividendos ni splits (esos son eventos de día completo).</w:t>
       </w:r>
     </w:p>
     <w:tbl>
@@ -2459,7 +2322,7 @@
                 <w:sz w:val="20"/>
                 <w:szCs w:val="20"/>
               </w:rPr>
-              <w:t xml:space="preserve">Inicio de la hora en UTC.</w:t>
+              <w:t xml:space="preserve">Inicio de la hora, en UTC.</w:t>
             </w:r>
           </w:p>
         </w:tc>
@@ -3031,7 +2894,7 @@
         <w:spacing w:after="120"/>
       </w:pPr>
       <w:r>
-        <w:t xml:space="preserve">Una fila por empresa. Metadatos que no cambian con frecuencia.</w:t>
+        <w:t xml:space="preserve">Una fila por ticker con la metadata que casi no cambia. El campo Parent_Brand agrupa múltiples cotizaciones de una misma empresa (ej. AVAL, GRUPOAVAL.CL y PFAVAL.CL comparten parent_brand = 'Grupo Aval').</w:t>
       </w:r>
     </w:p>
     <w:tbl>
@@ -3230,7 +3093,7 @@
                 <w:sz w:val="20"/>
                 <w:szCs w:val="20"/>
               </w:rPr>
-              <w:t xml:space="preserve">Código bursátil (Primary Key).</w:t>
+              <w:t xml:space="preserve">Código bursátil (PK).</w:t>
             </w:r>
           </w:p>
         </w:tc>
@@ -3322,7 +3185,7 @@
                 <w:sz w:val="20"/>
                 <w:szCs w:val="20"/>
               </w:rPr>
-              <w:t xml:space="preserve">Nombre comercial (ej. "Ecopetrol", "Bancolombia").</w:t>
+              <w:t xml:space="preserve">Nombre comercial de la cotización específica.</w:t>
             </w:r>
           </w:p>
         </w:tc>
@@ -3354,7 +3217,7 @@
                 <w:sz w:val="20"/>
                 <w:szCs w:val="20"/>
               </w:rPr>
-              <w:t xml:space="preserve">Industry_Tag</w:t>
+              <w:t xml:space="preserve">Parent_Brand</w:t>
             </w:r>
           </w:p>
         </w:tc>
@@ -3414,7 +3277,7 @@
                 <w:sz w:val="20"/>
                 <w:szCs w:val="20"/>
               </w:rPr>
-              <w:t xml:space="preserve">Sector (oil_gas, banking, technology, etc.).</w:t>
+              <w:t xml:space="preserve">Nombre de la empresa madre (agrupa cotizaciones múltiples).</w:t>
             </w:r>
           </w:p>
         </w:tc>
@@ -3446,7 +3309,7 @@
                 <w:sz w:val="20"/>
                 <w:szCs w:val="20"/>
               </w:rPr>
-              <w:t xml:space="preserve">Exchange</w:t>
+              <w:t xml:space="preserve">Industry_Tag</w:t>
             </w:r>
           </w:p>
         </w:tc>
@@ -3506,7 +3369,7 @@
                 <w:sz w:val="20"/>
                 <w:szCs w:val="20"/>
               </w:rPr>
-              <w:t xml:space="preserve">Bolsa donde cotiza (NYSE, NASDAQ, BVC).</w:t>
+              <w:t xml:space="preserve">Sector (banking, oil_gas, technology, etc.).</w:t>
             </w:r>
           </w:p>
         </w:tc>
@@ -3538,7 +3401,7 @@
                 <w:sz w:val="20"/>
                 <w:szCs w:val="20"/>
               </w:rPr>
-              <w:t xml:space="preserve">Country</w:t>
+              <w:t xml:space="preserve">Exchange</w:t>
             </w:r>
           </w:p>
         </w:tc>
@@ -3598,7 +3461,7 @@
                 <w:sz w:val="20"/>
                 <w:szCs w:val="20"/>
               </w:rPr>
-              <w:t xml:space="preserve">País de origen del negocio.</w:t>
+              <w:t xml:space="preserve">Bolsa donde cotiza (NYSE, NASDAQ, BVC).</w:t>
             </w:r>
           </w:p>
         </w:tc>
@@ -3630,6 +3493,98 @@
                 <w:sz w:val="20"/>
                 <w:szCs w:val="20"/>
               </w:rPr>
+              <w:t xml:space="preserve">Country</w:t>
+            </w:r>
+          </w:p>
+        </w:tc>
+        <w:tc>
+          <w:tcPr>
+            <w:tcW w:type="dxa" w:w="1600"/>
+            <w:tcBorders>
+              <w:top w:val="single" w:color="BFBFBF" w:sz="1"/>
+              <w:left w:val="single" w:color="BFBFBF" w:sz="1"/>
+              <w:bottom w:val="single" w:color="BFBFBF" w:sz="1"/>
+              <w:right w:val="single" w:color="BFBFBF" w:sz="1"/>
+            </w:tcBorders>
+            <w:shd w:fill="F7F9FC" w:val="clear"/>
+            <w:tcMar>
+              <w:top w:type="dxa" w:w="80"/>
+              <w:left w:type="dxa" w:w="120"/>
+              <w:bottom w:type="dxa" w:w="80"/>
+              <w:right w:type="dxa" w:w="120"/>
+            </w:tcMar>
+          </w:tcPr>
+          <w:p>
+            <w:r>
+              <w:rPr>
+                <w:b w:val="false"/>
+                <w:bCs w:val="false"/>
+                <w:color w:val="000000"/>
+                <w:sz w:val="20"/>
+                <w:szCs w:val="20"/>
+              </w:rPr>
+              <w:t xml:space="preserve">STRING</w:t>
+            </w:r>
+          </w:p>
+        </w:tc>
+        <w:tc>
+          <w:tcPr>
+            <w:tcW w:type="dxa" w:w="5360"/>
+            <w:tcBorders>
+              <w:top w:val="single" w:color="BFBFBF" w:sz="1"/>
+              <w:left w:val="single" w:color="BFBFBF" w:sz="1"/>
+              <w:bottom w:val="single" w:color="BFBFBF" w:sz="1"/>
+              <w:right w:val="single" w:color="BFBFBF" w:sz="1"/>
+            </w:tcBorders>
+            <w:shd w:fill="F7F9FC" w:val="clear"/>
+            <w:tcMar>
+              <w:top w:type="dxa" w:w="80"/>
+              <w:left w:type="dxa" w:w="120"/>
+              <w:bottom w:type="dxa" w:w="80"/>
+              <w:right w:type="dxa" w:w="120"/>
+            </w:tcMar>
+          </w:tcPr>
+          <w:p>
+            <w:r>
+              <w:rPr>
+                <w:b w:val="false"/>
+                <w:bCs w:val="false"/>
+                <w:color w:val="000000"/>
+                <w:sz w:val="20"/>
+                <w:szCs w:val="20"/>
+              </w:rPr>
+              <w:t xml:space="preserve">País de origen del negocio.</w:t>
+            </w:r>
+          </w:p>
+        </w:tc>
+      </w:tr>
+      <w:tr>
+        <w:tc>
+          <w:tcPr>
+            <w:tcW w:type="dxa" w:w="2400"/>
+            <w:tcBorders>
+              <w:top w:val="single" w:color="BFBFBF" w:sz="1"/>
+              <w:left w:val="single" w:color="BFBFBF" w:sz="1"/>
+              <w:bottom w:val="single" w:color="BFBFBF" w:sz="1"/>
+              <w:right w:val="single" w:color="BFBFBF" w:sz="1"/>
+            </w:tcBorders>
+            <w:shd w:fill="FFFFFF" w:val="clear"/>
+            <w:tcMar>
+              <w:top w:type="dxa" w:w="80"/>
+              <w:left w:type="dxa" w:w="120"/>
+              <w:bottom w:type="dxa" w:w="80"/>
+              <w:right w:type="dxa" w:w="120"/>
+            </w:tcMar>
+          </w:tcPr>
+          <w:p>
+            <w:r>
+              <w:rPr>
+                <w:b w:val="false"/>
+                <w:bCs w:val="false"/>
+                <w:color w:val="000000"/>
+                <w:sz w:val="20"/>
+                <w:szCs w:val="20"/>
+              </w:rPr>
               <w:t xml:space="preserve">Currency</w:t>
             </w:r>
           </w:p>
@@ -3643,7 +3598,7 @@
               <w:bottom w:val="single" w:color="BFBFBF" w:sz="1"/>
               <w:right w:val="single" w:color="BFBFBF" w:sz="1"/>
             </w:tcBorders>
-            <w:shd w:fill="F7F9FC" w:val="clear"/>
+            <w:shd w:fill="FFFFFF" w:val="clear"/>
             <w:tcMar>
               <w:top w:type="dxa" w:w="80"/>
               <w:left w:type="dxa" w:w="120"/>
@@ -3673,24 +3628,24 @@
               <w:bottom w:val="single" w:color="BFBFBF" w:sz="1"/>
               <w:right w:val="single" w:color="BFBFBF" w:sz="1"/>
             </w:tcBorders>
-            <w:shd w:fill="F7F9FC" w:val="clear"/>
-            <w:tcMar>
-              <w:top w:type="dxa" w:w="80"/>
-              <w:left w:type="dxa" w:w="120"/>
-              <w:bottom w:type="dxa" w:w="80"/>
-              <w:right w:type="dxa" w:w="120"/>
-            </w:tcMar>
-          </w:tcPr>
-          <w:p>
-            <w:r>
-              <w:rPr>
-                <w:b w:val="false"/>
-                <w:bCs w:val="false"/>
-                <w:color w:val="000000"/>
-                <w:sz w:val="20"/>
-                <w:szCs w:val="20"/>
-              </w:rPr>
-              <w:t xml:space="preserve">Moneda de los precios (USD para ADRs, COP para BVC).</w:t>
+            <w:shd w:fill="FFFFFF" w:val="clear"/>
+            <w:tcMar>
+              <w:top w:type="dxa" w:w="80"/>
+              <w:left w:type="dxa" w:w="120"/>
+              <w:bottom w:type="dxa" w:w="80"/>
+              <w:right w:type="dxa" w:w="120"/>
+            </w:tcMar>
+          </w:tcPr>
+          <w:p>
+            <w:r>
+              <w:rPr>
+                <w:b w:val="false"/>
+                <w:bCs w:val="false"/>
+                <w:color w:val="000000"/>
+                <w:sz w:val="20"/>
+                <w:szCs w:val="20"/>
+              </w:rPr>
+              <w:t xml:space="preserve">Moneda de los precios (USD, COP).</w:t>
             </w:r>
           </w:p>
         </w:tc>
@@ -3710,7 +3665,7 @@
         <w:spacing w:after="120"/>
       </w:pPr>
       <w:r>
-        <w:t xml:space="preserve">Calculada por SQL sobre stock_data_dwh en cada corrida. No requiere ingesta externa.</w:t>
+        <w:t xml:space="preserve">Calculada por SQL sobre stock_data_dwh en cada corrida del pipeline.</w:t>
       </w:r>
     </w:p>
     <w:tbl>
@@ -4277,7 +4232,7 @@
                 <w:sz w:val="20"/>
                 <w:szCs w:val="20"/>
               </w:rPr>
-              <w:t xml:space="preserve">Promedio del Close en los últimos 20 días de mercado.</w:t>
+              <w:t xml:space="preserve">Promedio del Close de los últimos 20 días de mercado.</w:t>
             </w:r>
           </w:p>
         </w:tc>
@@ -4369,7 +4324,7 @@
                 <w:sz w:val="20"/>
                 <w:szCs w:val="20"/>
               </w:rPr>
-              <w:t xml:space="preserve">Desviación estándar de daily_return en los últimos 20 días.</w:t>
+              <w:t xml:space="preserve">Desviación estándar de daily_return de los últimos 20 días.</w:t>
             </w:r>
           </w:p>
         </w:tc>
@@ -4389,7 +4344,42 @@
         <w:spacing w:after="120"/>
       </w:pPr>
       <w:r>
-        <w:t xml:space="preserve">Las tablas base guardan datos en UTC y normalizados (correcto para storage). Las vistas hacen JOIN con la dimensión y agregan columnas de conveniencia:</w:t>
+        <w:t xml:space="preserve">Las tablas base están en UTC y normalizadas (correcto para storage), pero eso las hace incómodas para preview manual. Las vistas hacen el JOIN con la dimensión y agregan Date_COT / Timestamp_COT (hora Colombia). Para queries y previews humanas, usar siempre las vistas.</w:t>
+      </w:r>
+    </w:p>
+    <w:p>
+      <w:pPr>
+        <w:pStyle w:val="Heading1"/>
+        <w:spacing w:after="200" w:before="360"/>
+      </w:pPr>
+      <w:r>
+        <w:t xml:space="preserve">6. Flujo del pipeline (ETL)</w:t>
+      </w:r>
+    </w:p>
+    <w:p>
+      <w:pPr>
+        <w:pStyle w:val="Heading2"/>
+        <w:spacing w:after="160" w:before="280"/>
+      </w:pPr>
+      <w:r>
+        <w:t xml:space="preserve">6.1. Extract</w:t>
+      </w:r>
+    </w:p>
+    <w:p>
+      <w:pPr>
+        <w:spacing w:after="120"/>
+      </w:pPr>
+      <w:r>
+        <w:t xml:space="preserve">Se descarga un ticker a la vez desde Yahoo Finance. La descarga diaria es incremental (últimos 5 días para el fact diario, últimos 3 para el horario), lo que da un colchón por si el pipeline falla un día.</w:t>
+      </w:r>
+    </w:p>
+    <w:p>
+      <w:pPr>
+        <w:pStyle w:val="Heading2"/>
+        <w:spacing w:after="160" w:before="280"/>
+      </w:pPr>
+      <w:r>
+        <w:t xml:space="preserve">6.2. Transform</w:t>
       </w:r>
     </w:p>
     <w:p>
@@ -4402,7 +4392,7 @@
         <w:spacing w:after="60"/>
       </w:pPr>
       <w:r>
-        <w:t xml:space="preserve">Date_COT / Timestamp_COT: fecha/hora convertida a zona horaria de Colombia.</w:t>
+        <w:t xml:space="preserve">Renombrar columnas para consistencia.</w:t>
       </w:r>
     </w:p>
     <w:p>
@@ -4415,66 +4405,7 @@
         <w:spacing w:after="60"/>
       </w:pPr>
       <w:r>
-        <w:t xml:space="preserve">Brand_Name, Currency, Industry_Tag: traídos desde tickers_dim.</w:t>
-      </w:r>
-    </w:p>
-    <w:p>
-      <w:pPr>
-        <w:spacing w:after="120"/>
-      </w:pPr>
-      <w:r>
-        <w:t xml:space="preserve">Al previsualizar en la consola de BigQuery, usar las vistas en vez de las tablas crudas es mucho más legible.</w:t>
-      </w:r>
-    </w:p>
-    <w:p>
-      <w:pPr>
-        <w:pStyle w:val="Heading1"/>
-        <w:spacing w:after="200" w:before="360"/>
-      </w:pPr>
-      <w:r>
-        <w:t xml:space="preserve">6. Flujo del pipeline (ETL)</w:t>
-      </w:r>
-    </w:p>
-    <w:p>
-      <w:pPr>
-        <w:spacing w:after="120"/>
-      </w:pPr>
-      <w:r>
-        <w:t xml:space="preserve">El pipeline sigue el patrón clásico Extract → Transform → Load. Cada fase está en una función separada en etl_pipeline.py.</w:t>
-      </w:r>
-    </w:p>
-    <w:p>
-      <w:pPr>
-        <w:pStyle w:val="Heading2"/>
-        <w:spacing w:after="160" w:before="280"/>
-      </w:pPr>
-      <w:r>
-        <w:t xml:space="preserve">6.1. Extract</w:t>
-      </w:r>
-    </w:p>
-    <w:p>
-      <w:pPr>
-        <w:spacing w:after="120"/>
-      </w:pPr>
-      <w:r>
-        <w:t xml:space="preserve">Se descarga un ticker a la vez desde Yahoo Finance. La descarga es incremental: por default trae los últimos 5 días (LOOKBACK_DAYS=5) para el diario y los últimos 3 días para el horario. Este colchón cubre el caso en que el pipeline falle un día y necesite recuperar datos.</w:t>
-      </w:r>
-    </w:p>
-    <w:p>
-      <w:pPr>
-        <w:pStyle w:val="Heading2"/>
-        <w:spacing w:after="160" w:before="280"/>
-      </w:pPr>
-      <w:r>
-        <w:t xml:space="preserve">6.2. Transform</w:t>
-      </w:r>
-    </w:p>
-    <w:p>
-      <w:pPr>
-        <w:spacing w:after="120"/>
-      </w:pPr>
-      <w:r>
-        <w:t xml:space="preserve">Con pandas se hace:</w:t>
+        <w:t xml:space="preserve">Cast de tipos: TIMESTAMP UTC, FLOAT64, INT64.</w:t>
       </w:r>
     </w:p>
     <w:p>
@@ -4487,7 +4418,7 @@
         <w:spacing w:after="60"/>
       </w:pPr>
       <w:r>
-        <w:t xml:space="preserve">Renombrar columnas para consistencia (ej. "Stock Splits" → "Stock_Splits").</w:t>
+        <w:t xml:space="preserve">Redondeo a 4 decimales (evita el ruido visual de float64).</w:t>
       </w:r>
     </w:p>
     <w:p>
@@ -4500,7 +4431,7 @@
         <w:spacing w:after="60"/>
       </w:pPr>
       <w:r>
-        <w:t xml:space="preserve">Cast de tipos: fechas a TIMESTAMP UTC, precios a FLOAT64, volumen a INT64.</w:t>
+        <w:t xml:space="preserve">Descarte de filas incompletas.</w:t>
       </w:r>
     </w:p>
     <w:p>
@@ -4513,33 +4444,7 @@
         <w:spacing w:after="60"/>
       </w:pPr>
       <w:r>
-        <w:t xml:space="preserve">Redondeo a 4 decimales para evitar ruido visual del float64.</w:t>
-      </w:r>
-    </w:p>
-    <w:p>
-      <w:pPr>
-        <w:pStyle w:val="ListParagraph"/>
-        <w:numPr>
-          <w:ilvl w:val="0"/>
-          <w:numId w:val="2"/>
-        </w:numPr>
-        <w:spacing w:after="60"/>
-      </w:pPr>
-      <w:r>
-        <w:t xml:space="preserve">Descarte de filas con datos incompletos.</w:t>
-      </w:r>
-    </w:p>
-    <w:p>
-      <w:pPr>
-        <w:pStyle w:val="ListParagraph"/>
-        <w:numPr>
-          <w:ilvl w:val="0"/>
-          <w:numId w:val="2"/>
-        </w:numPr>
-        <w:spacing w:after="60"/>
-      </w:pPr>
-      <w:r>
-        <w:t xml:space="preserve">Agregado de la columna Ticker para identificar cada fila (necesario porque descargamos varios tickers).</w:t>
+        <w:t xml:space="preserve">Agregado de la columna Ticker para identificar cada fila.</w:t>
       </w:r>
     </w:p>
     <w:p>
@@ -4548,15 +4453,7 @@
         <w:spacing w:after="160" w:before="280"/>
       </w:pPr>
       <w:r>
-        <w:t xml:space="preserve">6.3. Load</w:t>
-      </w:r>
-    </w:p>
-    <w:p>
-      <w:pPr>
-        <w:spacing w:after="120"/>
-      </w:pPr>
-      <w:r>
-        <w:t xml:space="preserve">Aquí ocurre la clave del sistema: idempotencia via MERGE.</w:t>
+        <w:t xml:space="preserve">6.3. Load (idempotencia via MERGE)</w:t>
       </w:r>
     </w:p>
     <w:p>
@@ -4569,7 +4466,7 @@
         <w:spacing w:after="60"/>
       </w:pPr>
       <w:r>
-        <w:t xml:space="preserve">El DataFrame se sube primero a una tabla temporal (_tmp_fact_load).</w:t>
+        <w:t xml:space="preserve">El DataFrame se sube a una tabla temporal (_tmp_fact_load).</w:t>
       </w:r>
     </w:p>
     <w:p>
@@ -4582,7 +4479,7 @@
         <w:spacing w:after="60"/>
       </w:pPr>
       <w:r>
-        <w:t xml:space="preserve">Se ejecuta un MERGE contra la tabla final: WHEN NOT MATCHED THEN INSERT.</w:t>
+        <w:t xml:space="preserve">Se ejecuta MERGE contra la tabla final: WHEN NOT MATCHED THEN INSERT.</w:t>
       </w:r>
     </w:p>
     <w:p>
@@ -4595,7 +4492,7 @@
         <w:spacing w:after="60"/>
       </w:pPr>
       <w:r>
-        <w:t xml:space="preserve">La condición de match es (Date, Ticker) para el fact diario, (Timestamp, Ticker) para el horario.</w:t>
+        <w:t xml:space="preserve">La condición de match es (Date, Ticker) para diario, (Timestamp, Ticker) para horario.</w:t>
       </w:r>
     </w:p>
     <w:p>
@@ -4616,7 +4513,7 @@
         <w:spacing w:after="120"/>
       </w:pPr>
       <w:r>
-        <w:t xml:space="preserve">Resultado: si corres el pipeline dos veces el mismo día, la segunda corrida inserta cero filas nuevas y no rompe nada.</w:t>
+        <w:t xml:space="preserve">Resultado: correr el pipeline múltiples veces el mismo día inserta cero filas nuevas y no rompe nada.</w:t>
       </w:r>
     </w:p>
     <w:p>
@@ -4633,41 +4530,7 @@
         <w:spacing w:after="120"/>
       </w:pPr>
       <w:r>
-        <w:t xml:space="preserve">Después de cargar los facts, el pipeline ejecuta dos queries adicionales:</w:t>
-      </w:r>
-    </w:p>
-    <w:p>
-      <w:pPr>
-        <w:pStyle w:val="ListParagraph"/>
-        <w:numPr>
-          <w:ilvl w:val="0"/>
-          <w:numId w:val="2"/>
-        </w:numPr>
-        <w:spacing w:after="60"/>
-      </w:pPr>
-      <w:r>
-        <w:t xml:space="preserve">CREATE OR REPLACE TABLE stock_metrics AS SELECT ... con window functions.</w:t>
-      </w:r>
-    </w:p>
-    <w:p>
-      <w:pPr>
-        <w:pStyle w:val="ListParagraph"/>
-        <w:numPr>
-          <w:ilvl w:val="0"/>
-          <w:numId w:val="2"/>
-        </w:numPr>
-        <w:spacing w:after="60"/>
-      </w:pPr>
-      <w:r>
-        <w:t xml:space="preserve">CREATE OR REPLACE VIEW ... para las dos vistas enriquecidas.</w:t>
-      </w:r>
-    </w:p>
-    <w:p>
-      <w:pPr>
-        <w:spacing w:after="120"/>
-      </w:pPr>
-      <w:r>
-        <w:t xml:space="preserve">Estas son operaciones baratas y garantizan que las métricas y vistas siempre reflejan los datos más recientes.</w:t>
+        <w:t xml:space="preserve">Tras cargar los facts, el pipeline ejecuta CREATE OR REPLACE TABLE para stock_metrics y CREATE OR REPLACE VIEW para las dos vistas. Operaciones baratas que garantizan consistencia con los datos más recientes.</w:t>
       </w:r>
     </w:p>
     <w:p>
@@ -4677,14 +4540,6 @@
       </w:pPr>
       <w:r>
         <w:t xml:space="preserve">6.5. Modo diario vs modo backfill</w:t>
-      </w:r>
-    </w:p>
-    <w:p>
-      <w:pPr>
-        <w:spacing w:after="120"/>
-      </w:pPr>
-      <w:r>
-        <w:t xml:space="preserve">El pipeline tiene dos modos controlados por la variable de entorno BACKFILL_START:</w:t>
       </w:r>
     </w:p>
     <w:tbl>
@@ -4883,7 +4738,7 @@
                 <w:sz w:val="20"/>
                 <w:szCs w:val="20"/>
               </w:rPr>
-              <w:t xml:space="preserve">Últimos 5 días (diario) + últimos 3 días (horario).</w:t>
+              <w:t xml:space="preserve">Últimos 5 días (diario) + 3 días (horario).</w:t>
             </w:r>
           </w:p>
         </w:tc>
@@ -4945,7 +4800,7 @@
                 <w:sz w:val="20"/>
                 <w:szCs w:val="20"/>
               </w:rPr>
-              <w:t xml:space="preserve">BACKFILL_START=2020-01-01 python etl_pipeline.py</w:t>
+              <w:t xml:space="preserve">BACKFILL_START=2020-01-01 python ...</w:t>
             </w:r>
           </w:p>
         </w:tc>
@@ -4975,7 +4830,7 @@
                 <w:sz w:val="20"/>
                 <w:szCs w:val="20"/>
               </w:rPr>
-              <w:t xml:space="preserve">Toda la historia desde esa fecha. Horario capado a ~2 años por límite de Yahoo.</w:t>
+              <w:t xml:space="preserve">Historia desde esa fecha. Horario capado a ~2 años por límite de Yahoo.</w:t>
             </w:r>
           </w:p>
         </w:tc>
@@ -4992,14 +4847,6 @@
     </w:p>
     <w:p>
       <w:pPr>
-        <w:spacing w:after="120"/>
-      </w:pPr>
-      <w:r>
-        <w:t xml:space="preserve">Las tres métricas que calcula el sistema son la base del análisis financiero cuantitativo.</w:t>
-      </w:r>
-    </w:p>
-    <w:p>
-      <w:pPr>
         <w:pStyle w:val="Heading2"/>
         <w:spacing w:after="160" w:before="280"/>
       </w:pPr>
@@ -5020,7 +4867,7 @@
         <w:spacing w:after="120"/>
       </w:pPr>
       <w:r>
-        <w:t xml:space="preserve">Ejemplo: si Ecopetrol cerró en 12,50 ayer y en 12,80 hoy, el retorno diario es (12,80 − 12,50)/12,50 = 0,024 = +2,4%.</w:t>
+        <w:t xml:space="preserve">Ejemplo: si Ecopetrol cerró en 12,50 ayer y 12,80 hoy → retorno = (12,80 − 12,50)/12,50 = +2,4%.</w:t>
       </w:r>
     </w:p>
     <w:p>
@@ -5028,7 +4875,7 @@
         <w:spacing w:after="120"/>
       </w:pPr>
       <w:r>
-        <w:t xml:space="preserve">Uso: es la unidad básica para comparar rendimiento entre empresas de precios muy distintos. Amazon a US$180 y Ecopetrol a US$12 no son comparables por precio absoluto, pero sí por porcentaje de cambio.</w:t>
+        <w:t xml:space="preserve">Uso: unidad básica para comparar rendimiento entre acciones de precios absolutos muy distintos.</w:t>
       </w:r>
     </w:p>
     <w:p>
@@ -5037,7 +4884,7 @@
         <w:spacing w:after="160" w:before="280"/>
       </w:pPr>
       <w:r>
-        <w:t xml:space="preserve">7.2. Media móvil de 20 días (ma20)</w:t>
+        <w:t xml:space="preserve">7.2. Media móvil 20 días (ma20)</w:t>
       </w:r>
     </w:p>
     <w:p>
@@ -5045,23 +4892,7 @@
         <w:spacing w:after="120"/>
       </w:pPr>
       <w:r>
-        <w:t xml:space="preserve">Fórmula: ma20 = promedio del Close en los últimos 20 días de mercado.</w:t>
-      </w:r>
-    </w:p>
-    <w:p>
-      <w:pPr>
-        <w:spacing w:after="120"/>
-      </w:pPr>
-      <w:r>
-        <w:t xml:space="preserve">Interpretación: es el precio "promedio" del último mes de trading. Suaviza el ruido diario y permite ver la tendencia.</w:t>
-      </w:r>
-    </w:p>
-    <w:p>
-      <w:pPr>
-        <w:spacing w:after="120"/>
-      </w:pPr>
-      <w:r>
-        <w:t xml:space="preserve">Regla clásica: si el precio actual está por encima de ma20, la tendencia es alcista; si está por debajo, bajista. Los traders usan combinaciones de MA20, MA50 y MA200 para tomar decisiones.</w:t>
+        <w:t xml:space="preserve">Promedio del Close en los últimos 20 días de mercado. Suaviza el ruido y muestra la tendencia. Regla clásica: precio arriba de ma20 = alcista; abajo = bajista.</w:t>
       </w:r>
     </w:p>
     <w:p>
@@ -5070,7 +4901,7 @@
         <w:spacing w:after="160" w:before="280"/>
       </w:pPr>
       <w:r>
-        <w:t xml:space="preserve">7.3. Volatilidad de 20 días (volatility_20d)</w:t>
+        <w:t xml:space="preserve">7.3. Volatilidad 20 días (volatility_20d)</w:t>
       </w:r>
     </w:p>
     <w:p>
@@ -5078,23 +4909,7 @@
         <w:spacing w:after="120"/>
       </w:pPr>
       <w:r>
-        <w:t xml:space="preserve">Fórmula: volatility_20d = desviación estándar de daily_return en los últimos 20 días.</w:t>
-      </w:r>
-    </w:p>
-    <w:p>
-      <w:pPr>
-        <w:spacing w:after="120"/>
-      </w:pPr>
-      <w:r>
-        <w:t xml:space="preserve">Interpretación: qué tanto se mueve la acción. Alta volatilidad significa cambios grandes día a día (más riesgo y más oportunidad). Baja volatilidad significa precios estables.</w:t>
-      </w:r>
-    </w:p>
-    <w:p>
-      <w:pPr>
-        <w:spacing w:after="120"/>
-      </w:pPr>
-      <w:r>
-        <w:t xml:space="preserve">Ejemplo típico: Tesla tiene volatilidad diaria en el rango de 3-6%, mientras Ecopetrol suele estar entre 1-2%.</w:t>
+        <w:t xml:space="preserve">Desviación estándar de daily_return en los últimos 20 días. Alta = precio salvaje (más riesgo y oportunidad). Baja = precio estable.</w:t>
       </w:r>
     </w:p>
     <w:p>
@@ -5112,15 +4927,7 @@
         <w:spacing w:after="160" w:before="280"/>
       </w:pPr>
       <w:r>
-        <w:t xml:space="preserve">8.1. Configuración del cron</w:t>
-      </w:r>
-    </w:p>
-    <w:p>
-      <w:pPr>
-        <w:spacing w:after="120"/>
-      </w:pPr>
-      <w:r>
-        <w:t xml:space="preserve">El archivo .github/workflows/daily_etl.yml define el schedule:</w:t>
+        <w:t xml:space="preserve">8.1. Cron</w:t>
       </w:r>
     </w:p>
     <w:p>
@@ -5134,7 +4941,7 @@
           <w:sz w:val="20"/>
           <w:szCs w:val="20"/>
         </w:rPr>
-        <w:t xml:space="preserve">- cron: "0 22 * * *"   # todos los días a las 22:00 UTC (5:00 p.m. hora Colombia)</w:t>
+        <w:t xml:space="preserve">- cron: "0 22 * * *"   # 22:00 UTC = 5:00 PM Colombia</w:t>
       </w:r>
     </w:p>
     <w:p>
@@ -5142,7 +4949,7 @@
         <w:spacing w:after="120"/>
       </w:pPr>
       <w:r>
-        <w:t xml:space="preserve">A esa hora la BVC ya cerró (3 p.m. COT) y NYSE/NASDAQ también (3 p.m. COT en horario de verano), así que los datos del día ya están procesados en Yahoo.</w:t>
+        <w:t xml:space="preserve">A esa hora ya cerraron BVC (3 PM COT), NYSE y NASDAQ (3 PM COT en verano), y Yahoo procesó los datos del día.</w:t>
       </w:r>
     </w:p>
     <w:p>
@@ -5151,15 +4958,7 @@
         <w:spacing w:after="160" w:before="280"/>
       </w:pPr>
       <w:r>
-        <w:t xml:space="preserve">8.2. Cómo verificar que sigue vivo</w:t>
-      </w:r>
-    </w:p>
-    <w:p>
-      <w:pPr>
-        <w:spacing w:after="120"/>
-      </w:pPr>
-      <w:r>
-        <w:t xml:space="preserve">Formas de monitorear el estado:</w:t>
+        <w:t xml:space="preserve">8.2. Monitoreo</w:t>
       </w:r>
     </w:p>
     <w:p>
@@ -5172,7 +4971,7 @@
         <w:spacing w:after="60"/>
       </w:pPr>
       <w:r>
-        <w:t xml:space="preserve">Pestaña Actions del repo en GitHub — muestra el historial de runs con éxito/fallo.</w:t>
+        <w:t xml:space="preserve">Pestaña Actions del repo en GitHub — historial de runs con éxito/fallo.</w:t>
       </w:r>
     </w:p>
     <w:p>
@@ -5185,7 +4984,7 @@
         <w:spacing w:after="60"/>
       </w:pPr>
       <w:r>
-        <w:t xml:space="preserve">Comando gh run list — desde la terminal, últimas corridas.</w:t>
+        <w:t xml:space="preserve">Comando gh run list — últimas corridas desde terminal.</w:t>
       </w:r>
     </w:p>
     <w:p>
@@ -5198,7 +4997,7 @@
         <w:spacing w:after="60"/>
       </w:pPr>
       <w:r>
-        <w:t xml:space="preserve">Notificación por email automática de GitHub si un run falla.</w:t>
+        <w:t xml:space="preserve">Notificación por email automática si un run falla.</w:t>
       </w:r>
     </w:p>
     <w:p>
@@ -5211,7 +5010,7 @@
         <w:spacing w:after="60"/>
       </w:pPr>
       <w:r>
-        <w:t xml:space="preserve">Query directo a BigQuery: SELECT MAX(Date) FROM stock_data_dwh debe estar dentro de las últimas 48 horas.</w:t>
+        <w:t xml:space="preserve">Query: SELECT MAX(Date) FROM stock_data_dwh debe estar dentro de las últimas 48h.</w:t>
       </w:r>
     </w:p>
     <w:p>
@@ -5220,15 +5019,7 @@
         <w:spacing w:after="160" w:before="280"/>
       </w:pPr>
       <w:r>
-        <w:t xml:space="preserve">8.3. Cómo correrlo manualmente</w:t>
-      </w:r>
-    </w:p>
-    <w:p>
-      <w:pPr>
-        <w:spacing w:after="120"/>
-      </w:pPr>
-      <w:r>
-        <w:t xml:space="preserve">Desde la terminal:</w:t>
+        <w:t xml:space="preserve">8.3. Corrida manual</w:t>
       </w:r>
     </w:p>
     <w:p>
@@ -5247,19 +5038,11 @@
     </w:p>
     <w:p>
       <w:pPr>
-        <w:spacing w:after="120"/>
-      </w:pPr>
-      <w:r>
-        <w:t xml:space="preserve">O desde el navegador: pestaña Actions → workflow "Daily Stock ETL" → botón "Run workflow".</w:t>
-      </w:r>
-    </w:p>
-    <w:p>
-      <w:pPr>
         <w:pStyle w:val="Heading2"/>
         <w:spacing w:after="160" w:before="280"/>
       </w:pPr>
       <w:r>
-        <w:t xml:space="preserve">8.4. Cómo agregar una nueva empresa</w:t>
+        <w:t xml:space="preserve">8.4. Agregar una nueva empresa</w:t>
       </w:r>
     </w:p>
     <w:p>
@@ -5272,7 +5055,7 @@
         <w:spacing w:after="60"/>
       </w:pPr>
       <w:r>
-        <w:t xml:space="preserve">Editar el dict TICKERS en etl_pipeline.py con la nueva entrada.</w:t>
+        <w:t xml:space="preserve">Editar el dict TICKERS en etl_pipeline.py (incluir parent_brand, industry, etc.).</w:t>
       </w:r>
     </w:p>
     <w:p>
@@ -5285,7 +5068,7 @@
         <w:spacing w:after="60"/>
       </w:pPr>
       <w:r>
-        <w:t xml:space="preserve">Verificar que Yahoo Finance tiene datos: python test_tickers.py (script auxiliar).</w:t>
+        <w:t xml:space="preserve">Verificar con test_tickers.py que Yahoo tiene datos.</w:t>
       </w:r>
     </w:p>
     <w:p>
@@ -5298,7 +5081,20 @@
         <w:spacing w:after="60"/>
       </w:pPr>
       <w:r>
-        <w:t xml:space="preserve">Commit y push. En la próxima corrida (o disparándola a mano) los datos aparecen automáticamente.</w:t>
+        <w:t xml:space="preserve">Actualizar COMPANY_META en dashboard.py con dominio y descripción.</w:t>
+      </w:r>
+    </w:p>
+    <w:p>
+      <w:pPr>
+        <w:pStyle w:val="ListParagraph"/>
+        <w:numPr>
+          <w:ilvl w:val="0"/>
+          <w:numId w:val="3"/>
+        </w:numPr>
+        <w:spacing w:after="60"/>
+      </w:pPr>
+      <w:r>
+        <w:t xml:space="preserve">Commit y push; en la próxima corrida los datos aparecen.</w:t>
       </w:r>
     </w:p>
     <w:p>
@@ -5307,7 +5103,7 @@
         <w:spacing w:after="200" w:before="360"/>
       </w:pPr>
       <w:r>
-        <w:t xml:space="preserve">9. Seguridad y credenciales</w:t>
+        <w:t xml:space="preserve">9. API REST (FastAPI)</w:t>
       </w:r>
     </w:p>
     <w:p>
@@ -5316,7 +5112,7 @@
         <w:spacing w:after="160" w:before="280"/>
       </w:pPr>
       <w:r>
-        <w:t xml:space="preserve">9.1. Service Account</w:t>
+        <w:t xml:space="preserve">9.1. Qué es y para qué sirve</w:t>
       </w:r>
     </w:p>
     <w:p>
@@ -5324,7 +5120,657 @@
         <w:spacing w:after="120"/>
       </w:pPr>
       <w:r>
-        <w:t xml:space="preserve">El pipeline no usa credenciales humanas; usa una service account (SA) llamada stock-etl-bot. Es una "identidad robot" de Google Cloud con permisos mínimos:</w:t>
+        <w:t xml:space="preserve">Una API REST es una interfaz web que permite consultar los datos vía URLs, sin conocer SQL ni acceder directamente a BigQuery. Actúa como "puerta de entrada" única y controlada al data warehouse. En este proyecto la API es consumida por dos clientes: el dashboard visual y el agente conversacional.</w:t>
+      </w:r>
+    </w:p>
+    <w:p>
+      <w:pPr>
+        <w:pStyle w:val="Heading2"/>
+        <w:spacing w:after="160" w:before="280"/>
+      </w:pPr>
+      <w:r>
+        <w:t xml:space="preserve">9.2. Endpoints disponibles</w:t>
+      </w:r>
+    </w:p>
+    <w:tbl>
+      <w:tblPr>
+        <w:tblW w:type="dxa" w:w="9360"/>
+        <w:tblBorders>
+          <w:top w:val="single" w:color="auto" w:sz="4"/>
+          <w:left w:val="single" w:color="auto" w:sz="4"/>
+          <w:bottom w:val="single" w:color="auto" w:sz="4"/>
+          <w:right w:val="single" w:color="auto" w:sz="4"/>
+          <w:insideH w:val="single" w:color="auto" w:sz="4"/>
+          <w:insideV w:val="single" w:color="auto" w:sz="4"/>
+        </w:tblBorders>
+      </w:tblPr>
+      <w:tblGrid>
+        <w:gridCol w:w="3800"/>
+        <w:gridCol w:w="5560"/>
+      </w:tblGrid>
+      <w:tr>
+        <w:tc>
+          <w:tcPr>
+            <w:tcW w:type="dxa" w:w="3800"/>
+            <w:tcBorders>
+              <w:top w:val="single" w:color="BFBFBF" w:sz="1"/>
+              <w:left w:val="single" w:color="BFBFBF" w:sz="1"/>
+              <w:bottom w:val="single" w:color="BFBFBF" w:sz="1"/>
+              <w:right w:val="single" w:color="BFBFBF" w:sz="1"/>
+            </w:tcBorders>
+            <w:shd w:fill="2E75B6" w:val="clear"/>
+            <w:tcMar>
+              <w:top w:type="dxa" w:w="80"/>
+              <w:left w:type="dxa" w:w="120"/>
+              <w:bottom w:type="dxa" w:w="80"/>
+              <w:right w:type="dxa" w:w="120"/>
+            </w:tcMar>
+          </w:tcPr>
+          <w:p>
+            <w:r>
+              <w:rPr>
+                <w:b/>
+                <w:bCs/>
+                <w:color w:val="FFFFFF"/>
+                <w:sz w:val="20"/>
+                <w:szCs w:val="20"/>
+              </w:rPr>
+              <w:t xml:space="preserve">Endpoint</w:t>
+            </w:r>
+          </w:p>
+        </w:tc>
+        <w:tc>
+          <w:tcPr>
+            <w:tcW w:type="dxa" w:w="5560"/>
+            <w:tcBorders>
+              <w:top w:val="single" w:color="BFBFBF" w:sz="1"/>
+              <w:left w:val="single" w:color="BFBFBF" w:sz="1"/>
+              <w:bottom w:val="single" w:color="BFBFBF" w:sz="1"/>
+              <w:right w:val="single" w:color="BFBFBF" w:sz="1"/>
+            </w:tcBorders>
+            <w:shd w:fill="2E75B6" w:val="clear"/>
+            <w:tcMar>
+              <w:top w:type="dxa" w:w="80"/>
+              <w:left w:type="dxa" w:w="120"/>
+              <w:bottom w:type="dxa" w:w="80"/>
+              <w:right w:type="dxa" w:w="120"/>
+            </w:tcMar>
+          </w:tcPr>
+          <w:p>
+            <w:r>
+              <w:rPr>
+                <w:b/>
+                <w:bCs/>
+                <w:color w:val="FFFFFF"/>
+                <w:sz w:val="20"/>
+                <w:szCs w:val="20"/>
+              </w:rPr>
+              <w:t xml:space="preserve">Descripción</w:t>
+            </w:r>
+          </w:p>
+        </w:tc>
+      </w:tr>
+      <w:tr>
+        <w:tc>
+          <w:tcPr>
+            <w:tcW w:type="dxa" w:w="3800"/>
+            <w:tcBorders>
+              <w:top w:val="single" w:color="BFBFBF" w:sz="1"/>
+              <w:left w:val="single" w:color="BFBFBF" w:sz="1"/>
+              <w:bottom w:val="single" w:color="BFBFBF" w:sz="1"/>
+              <w:right w:val="single" w:color="BFBFBF" w:sz="1"/>
+            </w:tcBorders>
+            <w:shd w:fill="FFFFFF" w:val="clear"/>
+            <w:tcMar>
+              <w:top w:type="dxa" w:w="80"/>
+              <w:left w:type="dxa" w:w="120"/>
+              <w:bottom w:type="dxa" w:w="80"/>
+              <w:right w:type="dxa" w:w="120"/>
+            </w:tcMar>
+          </w:tcPr>
+          <w:p>
+            <w:r>
+              <w:rPr>
+                <w:b w:val="false"/>
+                <w:bCs w:val="false"/>
+                <w:color w:val="000000"/>
+                <w:sz w:val="20"/>
+                <w:szCs w:val="20"/>
+              </w:rPr>
+              <w:t xml:space="preserve">GET /</w:t>
+            </w:r>
+          </w:p>
+        </w:tc>
+        <w:tc>
+          <w:tcPr>
+            <w:tcW w:type="dxa" w:w="5560"/>
+            <w:tcBorders>
+              <w:top w:val="single" w:color="BFBFBF" w:sz="1"/>
+              <w:left w:val="single" w:color="BFBFBF" w:sz="1"/>
+              <w:bottom w:val="single" w:color="BFBFBF" w:sz="1"/>
+              <w:right w:val="single" w:color="BFBFBF" w:sz="1"/>
+            </w:tcBorders>
+            <w:shd w:fill="FFFFFF" w:val="clear"/>
+            <w:tcMar>
+              <w:top w:type="dxa" w:w="80"/>
+              <w:left w:type="dxa" w:w="120"/>
+              <w:bottom w:type="dxa" w:w="80"/>
+              <w:right w:type="dxa" w:w="120"/>
+            </w:tcMar>
+          </w:tcPr>
+          <w:p>
+            <w:r>
+              <w:rPr>
+                <w:b w:val="false"/>
+                <w:bCs w:val="false"/>
+                <w:color w:val="000000"/>
+                <w:sz w:val="20"/>
+                <w:szCs w:val="20"/>
+              </w:rPr>
+              <w:t xml:space="preserve">Health check — verifica que la API está viva.</w:t>
+            </w:r>
+          </w:p>
+        </w:tc>
+      </w:tr>
+      <w:tr>
+        <w:tc>
+          <w:tcPr>
+            <w:tcW w:type="dxa" w:w="3800"/>
+            <w:tcBorders>
+              <w:top w:val="single" w:color="BFBFBF" w:sz="1"/>
+              <w:left w:val="single" w:color="BFBFBF" w:sz="1"/>
+              <w:bottom w:val="single" w:color="BFBFBF" w:sz="1"/>
+              <w:right w:val="single" w:color="BFBFBF" w:sz="1"/>
+            </w:tcBorders>
+            <w:shd w:fill="F7F9FC" w:val="clear"/>
+            <w:tcMar>
+              <w:top w:type="dxa" w:w="80"/>
+              <w:left w:type="dxa" w:w="120"/>
+              <w:bottom w:type="dxa" w:w="80"/>
+              <w:right w:type="dxa" w:w="120"/>
+            </w:tcMar>
+          </w:tcPr>
+          <w:p>
+            <w:r>
+              <w:rPr>
+                <w:b w:val="false"/>
+                <w:bCs w:val="false"/>
+                <w:color w:val="000000"/>
+                <w:sz w:val="20"/>
+                <w:szCs w:val="20"/>
+              </w:rPr>
+              <w:t xml:space="preserve">GET /tickers</w:t>
+            </w:r>
+          </w:p>
+        </w:tc>
+        <w:tc>
+          <w:tcPr>
+            <w:tcW w:type="dxa" w:w="5560"/>
+            <w:tcBorders>
+              <w:top w:val="single" w:color="BFBFBF" w:sz="1"/>
+              <w:left w:val="single" w:color="BFBFBF" w:sz="1"/>
+              <w:bottom w:val="single" w:color="BFBFBF" w:sz="1"/>
+              <w:right w:val="single" w:color="BFBFBF" w:sz="1"/>
+            </w:tcBorders>
+            <w:shd w:fill="F7F9FC" w:val="clear"/>
+            <w:tcMar>
+              <w:top w:type="dxa" w:w="80"/>
+              <w:left w:type="dxa" w:w="120"/>
+              <w:bottom w:type="dxa" w:w="80"/>
+              <w:right w:type="dxa" w:w="120"/>
+            </w:tcMar>
+          </w:tcPr>
+          <w:p>
+            <w:r>
+              <w:rPr>
+                <w:b w:val="false"/>
+                <w:bCs w:val="false"/>
+                <w:color w:val="000000"/>
+                <w:sz w:val="20"/>
+                <w:szCs w:val="20"/>
+              </w:rPr>
+              <w:t xml:space="preserve">Lista todos los tickers con metadata (incluye parent_brand).</w:t>
+            </w:r>
+          </w:p>
+        </w:tc>
+      </w:tr>
+      <w:tr>
+        <w:tc>
+          <w:tcPr>
+            <w:tcW w:type="dxa" w:w="3800"/>
+            <w:tcBorders>
+              <w:top w:val="single" w:color="BFBFBF" w:sz="1"/>
+              <w:left w:val="single" w:color="BFBFBF" w:sz="1"/>
+              <w:bottom w:val="single" w:color="BFBFBF" w:sz="1"/>
+              <w:right w:val="single" w:color="BFBFBF" w:sz="1"/>
+            </w:tcBorders>
+            <w:shd w:fill="FFFFFF" w:val="clear"/>
+            <w:tcMar>
+              <w:top w:type="dxa" w:w="80"/>
+              <w:left w:type="dxa" w:w="120"/>
+              <w:bottom w:type="dxa" w:w="80"/>
+              <w:right w:type="dxa" w:w="120"/>
+            </w:tcMar>
+          </w:tcPr>
+          <w:p>
+            <w:r>
+              <w:rPr>
+                <w:b w:val="false"/>
+                <w:bCs w:val="false"/>
+                <w:color w:val="000000"/>
+                <w:sz w:val="20"/>
+                <w:szCs w:val="20"/>
+              </w:rPr>
+              <w:t xml:space="preserve">GET /tickers/{ticker}</w:t>
+            </w:r>
+          </w:p>
+        </w:tc>
+        <w:tc>
+          <w:tcPr>
+            <w:tcW w:type="dxa" w:w="5560"/>
+            <w:tcBorders>
+              <w:top w:val="single" w:color="BFBFBF" w:sz="1"/>
+              <w:left w:val="single" w:color="BFBFBF" w:sz="1"/>
+              <w:bottom w:val="single" w:color="BFBFBF" w:sz="1"/>
+              <w:right w:val="single" w:color="BFBFBF" w:sz="1"/>
+            </w:tcBorders>
+            <w:shd w:fill="FFFFFF" w:val="clear"/>
+            <w:tcMar>
+              <w:top w:type="dxa" w:w="80"/>
+              <w:left w:type="dxa" w:w="120"/>
+              <w:bottom w:type="dxa" w:w="80"/>
+              <w:right w:type="dxa" w:w="120"/>
+            </w:tcMar>
+          </w:tcPr>
+          <w:p>
+            <w:r>
+              <w:rPr>
+                <w:b w:val="false"/>
+                <w:bCs w:val="false"/>
+                <w:color w:val="000000"/>
+                <w:sz w:val="20"/>
+                <w:szCs w:val="20"/>
+              </w:rPr>
+              <w:t xml:space="preserve">Metadata de un ticker específico.</w:t>
+            </w:r>
+          </w:p>
+        </w:tc>
+      </w:tr>
+      <w:tr>
+        <w:tc>
+          <w:tcPr>
+            <w:tcW w:type="dxa" w:w="3800"/>
+            <w:tcBorders>
+              <w:top w:val="single" w:color="BFBFBF" w:sz="1"/>
+              <w:left w:val="single" w:color="BFBFBF" w:sz="1"/>
+              <w:bottom w:val="single" w:color="BFBFBF" w:sz="1"/>
+              <w:right w:val="single" w:color="BFBFBF" w:sz="1"/>
+            </w:tcBorders>
+            <w:shd w:fill="F7F9FC" w:val="clear"/>
+            <w:tcMar>
+              <w:top w:type="dxa" w:w="80"/>
+              <w:left w:type="dxa" w:w="120"/>
+              <w:bottom w:type="dxa" w:w="80"/>
+              <w:right w:type="dxa" w:w="120"/>
+            </w:tcMar>
+          </w:tcPr>
+          <w:p>
+            <w:r>
+              <w:rPr>
+                <w:b w:val="false"/>
+                <w:bCs w:val="false"/>
+                <w:color w:val="000000"/>
+                <w:sz w:val="20"/>
+                <w:szCs w:val="20"/>
+              </w:rPr>
+              <w:t xml:space="preserve">GET /tickers/{ticker}/prices?days=30</w:t>
+            </w:r>
+          </w:p>
+        </w:tc>
+        <w:tc>
+          <w:tcPr>
+            <w:tcW w:type="dxa" w:w="5560"/>
+            <w:tcBorders>
+              <w:top w:val="single" w:color="BFBFBF" w:sz="1"/>
+              <w:left w:val="single" w:color="BFBFBF" w:sz="1"/>
+              <w:bottom w:val="single" w:color="BFBFBF" w:sz="1"/>
+              <w:right w:val="single" w:color="BFBFBF" w:sz="1"/>
+            </w:tcBorders>
+            <w:shd w:fill="F7F9FC" w:val="clear"/>
+            <w:tcMar>
+              <w:top w:type="dxa" w:w="80"/>
+              <w:left w:type="dxa" w:w="120"/>
+              <w:bottom w:type="dxa" w:w="80"/>
+              <w:right w:type="dxa" w:w="120"/>
+            </w:tcMar>
+          </w:tcPr>
+          <w:p>
+            <w:r>
+              <w:rPr>
+                <w:b w:val="false"/>
+                <w:bCs w:val="false"/>
+                <w:color w:val="000000"/>
+                <w:sz w:val="20"/>
+                <w:szCs w:val="20"/>
+              </w:rPr>
+              <w:t xml:space="preserve">Precios diarios (OHLCV) de los últimos N días.</w:t>
+            </w:r>
+          </w:p>
+        </w:tc>
+      </w:tr>
+      <w:tr>
+        <w:tc>
+          <w:tcPr>
+            <w:tcW w:type="dxa" w:w="3800"/>
+            <w:tcBorders>
+              <w:top w:val="single" w:color="BFBFBF" w:sz="1"/>
+              <w:left w:val="single" w:color="BFBFBF" w:sz="1"/>
+              <w:bottom w:val="single" w:color="BFBFBF" w:sz="1"/>
+              <w:right w:val="single" w:color="BFBFBF" w:sz="1"/>
+            </w:tcBorders>
+            <w:shd w:fill="FFFFFF" w:val="clear"/>
+            <w:tcMar>
+              <w:top w:type="dxa" w:w="80"/>
+              <w:left w:type="dxa" w:w="120"/>
+              <w:bottom w:type="dxa" w:w="80"/>
+              <w:right w:type="dxa" w:w="120"/>
+            </w:tcMar>
+          </w:tcPr>
+          <w:p>
+            <w:r>
+              <w:rPr>
+                <w:b w:val="false"/>
+                <w:bCs w:val="false"/>
+                <w:color w:val="000000"/>
+                <w:sz w:val="20"/>
+                <w:szCs w:val="20"/>
+              </w:rPr>
+              <w:t xml:space="preserve">GET /tickers/{ticker}/intraday?hours=48</w:t>
+            </w:r>
+          </w:p>
+        </w:tc>
+        <w:tc>
+          <w:tcPr>
+            <w:tcW w:type="dxa" w:w="5560"/>
+            <w:tcBorders>
+              <w:top w:val="single" w:color="BFBFBF" w:sz="1"/>
+              <w:left w:val="single" w:color="BFBFBF" w:sz="1"/>
+              <w:bottom w:val="single" w:color="BFBFBF" w:sz="1"/>
+              <w:right w:val="single" w:color="BFBFBF" w:sz="1"/>
+            </w:tcBorders>
+            <w:shd w:fill="FFFFFF" w:val="clear"/>
+            <w:tcMar>
+              <w:top w:type="dxa" w:w="80"/>
+              <w:left w:type="dxa" w:w="120"/>
+              <w:bottom w:type="dxa" w:w="80"/>
+              <w:right w:type="dxa" w:w="120"/>
+            </w:tcMar>
+          </w:tcPr>
+          <w:p>
+            <w:r>
+              <w:rPr>
+                <w:b w:val="false"/>
+                <w:bCs w:val="false"/>
+                <w:color w:val="000000"/>
+                <w:sz w:val="20"/>
+                <w:szCs w:val="20"/>
+              </w:rPr>
+              <w:t xml:space="preserve">Precios horarios (OHLCV) de las últimas N horas.</w:t>
+            </w:r>
+          </w:p>
+        </w:tc>
+      </w:tr>
+      <w:tr>
+        <w:tc>
+          <w:tcPr>
+            <w:tcW w:type="dxa" w:w="3800"/>
+            <w:tcBorders>
+              <w:top w:val="single" w:color="BFBFBF" w:sz="1"/>
+              <w:left w:val="single" w:color="BFBFBF" w:sz="1"/>
+              <w:bottom w:val="single" w:color="BFBFBF" w:sz="1"/>
+              <w:right w:val="single" w:color="BFBFBF" w:sz="1"/>
+            </w:tcBorders>
+            <w:shd w:fill="F7F9FC" w:val="clear"/>
+            <w:tcMar>
+              <w:top w:type="dxa" w:w="80"/>
+              <w:left w:type="dxa" w:w="120"/>
+              <w:bottom w:type="dxa" w:w="80"/>
+              <w:right w:type="dxa" w:w="120"/>
+            </w:tcMar>
+          </w:tcPr>
+          <w:p>
+            <w:r>
+              <w:rPr>
+                <w:b w:val="false"/>
+                <w:bCs w:val="false"/>
+                <w:color w:val="000000"/>
+                <w:sz w:val="20"/>
+                <w:szCs w:val="20"/>
+              </w:rPr>
+              <w:t xml:space="preserve">GET /tickers/{ticker}/metrics?days=30</w:t>
+            </w:r>
+          </w:p>
+        </w:tc>
+        <w:tc>
+          <w:tcPr>
+            <w:tcW w:type="dxa" w:w="5560"/>
+            <w:tcBorders>
+              <w:top w:val="single" w:color="BFBFBF" w:sz="1"/>
+              <w:left w:val="single" w:color="BFBFBF" w:sz="1"/>
+              <w:bottom w:val="single" w:color="BFBFBF" w:sz="1"/>
+              <w:right w:val="single" w:color="BFBFBF" w:sz="1"/>
+            </w:tcBorders>
+            <w:shd w:fill="F7F9FC" w:val="clear"/>
+            <w:tcMar>
+              <w:top w:type="dxa" w:w="80"/>
+              <w:left w:type="dxa" w:w="120"/>
+              <w:bottom w:type="dxa" w:w="80"/>
+              <w:right w:type="dxa" w:w="120"/>
+            </w:tcMar>
+          </w:tcPr>
+          <w:p>
+            <w:r>
+              <w:rPr>
+                <w:b w:val="false"/>
+                <w:bCs w:val="false"/>
+                <w:color w:val="000000"/>
+                <w:sz w:val="20"/>
+                <w:szCs w:val="20"/>
+              </w:rPr>
+              <w:t xml:space="preserve">Retorno diario, MA20, volatilidad.</w:t>
+            </w:r>
+          </w:p>
+        </w:tc>
+      </w:tr>
+      <w:tr>
+        <w:tc>
+          <w:tcPr>
+            <w:tcW w:type="dxa" w:w="3800"/>
+            <w:tcBorders>
+              <w:top w:val="single" w:color="BFBFBF" w:sz="1"/>
+              <w:left w:val="single" w:color="BFBFBF" w:sz="1"/>
+              <w:bottom w:val="single" w:color="BFBFBF" w:sz="1"/>
+              <w:right w:val="single" w:color="BFBFBF" w:sz="1"/>
+            </w:tcBorders>
+            <w:shd w:fill="FFFFFF" w:val="clear"/>
+            <w:tcMar>
+              <w:top w:type="dxa" w:w="80"/>
+              <w:left w:type="dxa" w:w="120"/>
+              <w:bottom w:type="dxa" w:w="80"/>
+              <w:right w:type="dxa" w:w="120"/>
+            </w:tcMar>
+          </w:tcPr>
+          <w:p>
+            <w:r>
+              <w:rPr>
+                <w:b w:val="false"/>
+                <w:bCs w:val="false"/>
+                <w:color w:val="000000"/>
+                <w:sz w:val="20"/>
+                <w:szCs w:val="20"/>
+              </w:rPr>
+              <w:t xml:space="preserve">GET /market/top-movers?limit=5&amp;direction=up</w:t>
+            </w:r>
+          </w:p>
+        </w:tc>
+        <w:tc>
+          <w:tcPr>
+            <w:tcW w:type="dxa" w:w="5560"/>
+            <w:tcBorders>
+              <w:top w:val="single" w:color="BFBFBF" w:sz="1"/>
+              <w:left w:val="single" w:color="BFBFBF" w:sz="1"/>
+              <w:bottom w:val="single" w:color="BFBFBF" w:sz="1"/>
+              <w:right w:val="single" w:color="BFBFBF" w:sz="1"/>
+            </w:tcBorders>
+            <w:shd w:fill="FFFFFF" w:val="clear"/>
+            <w:tcMar>
+              <w:top w:type="dxa" w:w="80"/>
+              <w:left w:type="dxa" w:w="120"/>
+              <w:bottom w:type="dxa" w:w="80"/>
+              <w:right w:type="dxa" w:w="120"/>
+            </w:tcMar>
+          </w:tcPr>
+          <w:p>
+            <w:r>
+              <w:rPr>
+                <w:b w:val="false"/>
+                <w:bCs w:val="false"/>
+                <w:color w:val="000000"/>
+                <w:sz w:val="20"/>
+                <w:szCs w:val="20"/>
+              </w:rPr>
+              <w:t xml:space="preserve">Ranking de tickers por retorno del último día.</w:t>
+            </w:r>
+          </w:p>
+        </w:tc>
+      </w:tr>
+      <w:tr>
+        <w:tc>
+          <w:tcPr>
+            <w:tcW w:type="dxa" w:w="3800"/>
+            <w:tcBorders>
+              <w:top w:val="single" w:color="BFBFBF" w:sz="1"/>
+              <w:left w:val="single" w:color="BFBFBF" w:sz="1"/>
+              <w:bottom w:val="single" w:color="BFBFBF" w:sz="1"/>
+              <w:right w:val="single" w:color="BFBFBF" w:sz="1"/>
+            </w:tcBorders>
+            <w:shd w:fill="F7F9FC" w:val="clear"/>
+            <w:tcMar>
+              <w:top w:type="dxa" w:w="80"/>
+              <w:left w:type="dxa" w:w="120"/>
+              <w:bottom w:type="dxa" w:w="80"/>
+              <w:right w:type="dxa" w:w="120"/>
+            </w:tcMar>
+          </w:tcPr>
+          <w:p>
+            <w:r>
+              <w:rPr>
+                <w:b w:val="false"/>
+                <w:bCs w:val="false"/>
+                <w:color w:val="000000"/>
+                <w:sz w:val="20"/>
+                <w:szCs w:val="20"/>
+              </w:rPr>
+              <w:t xml:space="preserve">GET /market/summary</w:t>
+            </w:r>
+          </w:p>
+        </w:tc>
+        <w:tc>
+          <w:tcPr>
+            <w:tcW w:type="dxa" w:w="5560"/>
+            <w:tcBorders>
+              <w:top w:val="single" w:color="BFBFBF" w:sz="1"/>
+              <w:left w:val="single" w:color="BFBFBF" w:sz="1"/>
+              <w:bottom w:val="single" w:color="BFBFBF" w:sz="1"/>
+              <w:right w:val="single" w:color="BFBFBF" w:sz="1"/>
+            </w:tcBorders>
+            <w:shd w:fill="F7F9FC" w:val="clear"/>
+            <w:tcMar>
+              <w:top w:type="dxa" w:w="80"/>
+              <w:left w:type="dxa" w:w="120"/>
+              <w:bottom w:type="dxa" w:w="80"/>
+              <w:right w:type="dxa" w:w="120"/>
+            </w:tcMar>
+          </w:tcPr>
+          <w:p>
+            <w:r>
+              <w:rPr>
+                <w:b w:val="false"/>
+                <w:bCs w:val="false"/>
+                <w:color w:val="000000"/>
+                <w:sz w:val="20"/>
+                <w:szCs w:val="20"/>
+              </w:rPr>
+              <w:t xml:space="preserve">Resumen del último día: activos, top ganador y perdedor.</w:t>
+            </w:r>
+          </w:p>
+        </w:tc>
+      </w:tr>
+    </w:tbl>
+    <w:p>
+      <w:pPr>
+        <w:pStyle w:val="Heading2"/>
+        <w:spacing w:after="160" w:before="280"/>
+      </w:pPr>
+      <w:r>
+        <w:t xml:space="preserve">9.3. Documentación interactiva (Swagger UI)</w:t>
+      </w:r>
+    </w:p>
+    <w:p>
+      <w:pPr>
+        <w:spacing w:after="120"/>
+      </w:pPr>
+      <w:r>
+        <w:t xml:space="preserve">FastAPI genera automáticamente una interfaz en /docs donde se puede explorar cada endpoint, ver los parámetros aceptados, y probarlos en vivo con botones "Try it out" — sin escribir código.</w:t>
+      </w:r>
+    </w:p>
+    <w:p>
+      <w:pPr>
+        <w:shd w:fill="E7F1FF" w:val="clear"/>
+        <w:spacing w:after="100" w:before="100"/>
+      </w:pPr>
+      <w:r>
+        <w:t xml:space="preserve">ℹ URL local: http://localhost:8080/docs — solo funciona mientras uvicorn esté corriendo.</w:t>
+      </w:r>
+    </w:p>
+    <w:p>
+      <w:pPr>
+        <w:pStyle w:val="Heading2"/>
+        <w:spacing w:after="160" w:before="280"/>
+      </w:pPr>
+      <w:r>
+        <w:t xml:space="preserve">9.4. Cómo se corre localmente</w:t>
+      </w:r>
+    </w:p>
+    <w:p>
+      <w:pPr>
+        <w:shd w:fill="F2F2F2" w:val="clear"/>
+        <w:spacing w:after="100" w:before="100"/>
+      </w:pPr>
+      <w:r>
+        <w:rPr>
+          <w:rFonts w:ascii="Courier New" w:cs="Courier New" w:eastAsia="Courier New" w:hAnsi="Courier New"/>
+          <w:sz w:val="20"/>
+          <w:szCs w:val="20"/>
+        </w:rPr>
+        <w:t xml:space="preserve">.venv/bin/python -m uvicorn api:app --reload --port 8080</w:t>
+      </w:r>
+    </w:p>
+    <w:p>
+      <w:pPr>
+        <w:spacing w:after="120"/>
+      </w:pPr>
+      <w:r>
+        <w:t xml:space="preserve">La bandera --reload hace que uvicorn se reinicie automáticamente cuando cambia api.py.</w:t>
+      </w:r>
+    </w:p>
+    <w:p>
+      <w:pPr>
+        <w:pStyle w:val="Heading2"/>
+        <w:spacing w:after="160" w:before="280"/>
+      </w:pPr>
+      <w:r>
+        <w:t xml:space="preserve">9.5. Tecnología detrás</w:t>
       </w:r>
     </w:p>
     <w:p>
@@ -5337,7 +5783,7 @@
         <w:spacing w:after="60"/>
       </w:pPr>
       <w:r>
-        <w:t xml:space="preserve">bigquery.dataEditor: crear y escribir tablas.</w:t>
+        <w:t xml:space="preserve">FastAPI: framework Python moderno; sintaxis basada en type hints.</w:t>
       </w:r>
     </w:p>
     <w:p>
@@ -5350,7 +5796,7 @@
         <w:spacing w:after="60"/>
       </w:pPr>
       <w:r>
-        <w:t xml:space="preserve">bigquery.jobUser: ejecutar queries.</w:t>
+        <w:t xml:space="preserve">uvicorn: servidor ASGI que ejecuta la app FastAPI.</w:t>
       </w:r>
     </w:p>
     <w:p>
@@ -5363,7 +5809,20 @@
         <w:spacing w:after="60"/>
       </w:pPr>
       <w:r>
-        <w:t xml:space="preserve">storage.objectAdmin: leer/escribir en el bucket (para uso futuro).</w:t>
+        <w:t xml:space="preserve">Pydantic: valida y serializa las respuestas (garantiza que cada endpoint devuelva JSON con el schema esperado).</w:t>
+      </w:r>
+    </w:p>
+    <w:p>
+      <w:pPr>
+        <w:pStyle w:val="ListParagraph"/>
+        <w:numPr>
+          <w:ilvl w:val="0"/>
+          <w:numId w:val="2"/>
+        </w:numPr>
+        <w:spacing w:after="60"/>
+      </w:pPr>
+      <w:r>
+        <w:t xml:space="preserve">google-cloud-bigquery: cliente Python que ejecuta las queries en BigQuery.</w:t>
       </w:r>
     </w:p>
     <w:p>
@@ -5372,7 +5831,7 @@
         <w:spacing w:after="160" w:before="280"/>
       </w:pPr>
       <w:r>
-        <w:t xml:space="preserve">9.2. Credencial (key.json)</w:t>
+        <w:t xml:space="preserve">9.6. Fix del "último día por ticker"</w:t>
       </w:r>
     </w:p>
     <w:p>
@@ -5380,7 +5839,16 @@
         <w:spacing w:after="120"/>
       </w:pPr>
       <w:r>
-        <w:t xml:space="preserve">La SA se autentica con un archivo JSON descargado desde GCP. Este archivo es equivalente a una contraseña y NUNCA debe subirse al repo. Está protegido por .gitignore.</w:t>
+        <w:t xml:space="preserve">Los endpoints /market/top-movers y /market/summary usan la fecha más reciente POR TICKER (no una fecha global). Así, los tickers de la BVC siguen apareciendo aunque hoy sea festivo en Colombia.</w:t>
+      </w:r>
+    </w:p>
+    <w:p>
+      <w:pPr>
+        <w:pStyle w:val="Heading1"/>
+        <w:spacing w:after="200" w:before="360"/>
+      </w:pPr>
+      <w:r>
+        <w:t xml:space="preserve">10. Dashboard visual (Streamlit)</w:t>
       </w:r>
     </w:p>
     <w:p>
@@ -5389,7 +5857,107 @@
         <w:spacing w:after="160" w:before="280"/>
       </w:pPr>
       <w:r>
-        <w:t xml:space="preserve">9.3. Secretos en GitHub</w:t>
+        <w:t xml:space="preserve">10.1. Qué muestra</w:t>
+      </w:r>
+    </w:p>
+    <w:p>
+      <w:pPr>
+        <w:pStyle w:val="ListParagraph"/>
+        <w:numPr>
+          <w:ilvl w:val="0"/>
+          <w:numId w:val="2"/>
+        </w:numPr>
+        <w:spacing w:after="60"/>
+      </w:pPr>
+      <w:r>
+        <w:t xml:space="preserve">Sidebar: selector de empresa (agrupada por parent_brand con banderas) + selector de cotización específica (cuando hay varias) + slider de días de historia.</w:t>
+      </w:r>
+    </w:p>
+    <w:p>
+      <w:pPr>
+        <w:pStyle w:val="ListParagraph"/>
+        <w:numPr>
+          <w:ilvl w:val="0"/>
+          <w:numId w:val="2"/>
+        </w:numPr>
+        <w:spacing w:after="60"/>
+      </w:pPr>
+      <w:r>
+        <w:t xml:space="preserve">Header: logo de la empresa, nombre, ticker, sector, bolsa, moneda y descripción breve.</w:t>
+      </w:r>
+    </w:p>
+    <w:p>
+      <w:pPr>
+        <w:pStyle w:val="ListParagraph"/>
+        <w:numPr>
+          <w:ilvl w:val="0"/>
+          <w:numId w:val="2"/>
+        </w:numPr>
+        <w:spacing w:after="60"/>
+      </w:pPr>
+      <w:r>
+        <w:t xml:space="preserve">KPI cards: precio último cierre, retorno del día (coloreado), MA20 y volatilidad.</w:t>
+      </w:r>
+    </w:p>
+    <w:p>
+      <w:pPr>
+        <w:pStyle w:val="ListParagraph"/>
+        <w:numPr>
+          <w:ilvl w:val="0"/>
+          <w:numId w:val="2"/>
+        </w:numPr>
+        <w:spacing w:after="60"/>
+      </w:pPr>
+      <w:r>
+        <w:t xml:space="preserve">Gráfico principal: candlestick OHLC con MA20 superpuesta + volumen abajo.</w:t>
+      </w:r>
+    </w:p>
+    <w:p>
+      <w:pPr>
+        <w:pStyle w:val="ListParagraph"/>
+        <w:numPr>
+          <w:ilvl w:val="0"/>
+          <w:numId w:val="2"/>
+        </w:numPr>
+        <w:spacing w:after="60"/>
+      </w:pPr>
+      <w:r>
+        <w:t xml:space="preserve">Gráfico intradía: precio hora a hora de las últimas 48h.</w:t>
+      </w:r>
+    </w:p>
+    <w:p>
+      <w:pPr>
+        <w:pStyle w:val="ListParagraph"/>
+        <w:numPr>
+          <w:ilvl w:val="0"/>
+          <w:numId w:val="2"/>
+        </w:numPr>
+        <w:spacing w:after="60"/>
+      </w:pPr>
+      <w:r>
+        <w:t xml:space="preserve">Top movers: 5 mayores subidas y 5 mayores caídas.</w:t>
+      </w:r>
+    </w:p>
+    <w:p>
+      <w:pPr>
+        <w:pStyle w:val="ListParagraph"/>
+        <w:numPr>
+          <w:ilvl w:val="0"/>
+          <w:numId w:val="2"/>
+        </w:numPr>
+        <w:spacing w:after="60"/>
+      </w:pPr>
+      <w:r>
+        <w:t xml:space="preserve">Aviso informativo: nota cuando la empresa seleccionada tiene cotizaciones adicionales que Yahoo no expone (ej. BCOLOMBIA.CL delistado).</w:t>
+      </w:r>
+    </w:p>
+    <w:p>
+      <w:pPr>
+        <w:pStyle w:val="Heading2"/>
+        <w:spacing w:after="160" w:before="280"/>
+      </w:pPr>
+      <w:r>
+        <w:t xml:space="preserve">10.2. Cómo se conecta a la API</w:t>
       </w:r>
     </w:p>
     <w:p>
@@ -5397,7 +5965,454 @@
         <w:spacing w:after="120"/>
       </w:pPr>
       <w:r>
-        <w:t xml:space="preserve">Para que GitHub Actions pueda autenticarse en GCP durante las corridas, el contenido de key.json está guardado como GitHub Secret cifrado:</w:t>
+        <w:t xml:space="preserve">El dashboard NO habla directo con BigQuery. Hace requests HTTP a la API REST y renderiza las respuestas. Esto separa responsabilidades y permite reutilizar la misma API con múltiples frontends.</w:t>
+      </w:r>
+    </w:p>
+    <w:p>
+      <w:pPr>
+        <w:pStyle w:val="Heading2"/>
+        <w:spacing w:after="160" w:before="280"/>
+      </w:pPr>
+      <w:r>
+        <w:t xml:space="preserve">10.3. Tecnología</w:t>
+      </w:r>
+    </w:p>
+    <w:p>
+      <w:pPr>
+        <w:pStyle w:val="ListParagraph"/>
+        <w:numPr>
+          <w:ilvl w:val="0"/>
+          <w:numId w:val="2"/>
+        </w:numPr>
+        <w:spacing w:after="60"/>
+      </w:pPr>
+      <w:r>
+        <w:t xml:space="preserve">Streamlit: framework Python que traduce código en interfaz web.</w:t>
+      </w:r>
+    </w:p>
+    <w:p>
+      <w:pPr>
+        <w:pStyle w:val="ListParagraph"/>
+        <w:numPr>
+          <w:ilvl w:val="0"/>
+          <w:numId w:val="2"/>
+        </w:numPr>
+        <w:spacing w:after="60"/>
+      </w:pPr>
+      <w:r>
+        <w:t xml:space="preserve">Plotly: librería de gráficos interactivos (candlesticks, líneas, barras).</w:t>
+      </w:r>
+    </w:p>
+    <w:p>
+      <w:pPr>
+        <w:pStyle w:val="ListParagraph"/>
+        <w:numPr>
+          <w:ilvl w:val="0"/>
+          <w:numId w:val="2"/>
+        </w:numPr>
+        <w:spacing w:after="60"/>
+      </w:pPr>
+      <w:r>
+        <w:t xml:space="preserve">Requests: cliente HTTP para llamar a la API.</w:t>
+      </w:r>
+    </w:p>
+    <w:p>
+      <w:pPr>
+        <w:pStyle w:val="ListParagraph"/>
+        <w:numPr>
+          <w:ilvl w:val="0"/>
+          <w:numId w:val="2"/>
+        </w:numPr>
+        <w:spacing w:after="60"/>
+      </w:pPr>
+      <w:r>
+        <w:t xml:space="preserve">Cache de datos: @st.cache_data(ttl=300) evita repetir requests dentro de 5 minutos.</w:t>
+      </w:r>
+    </w:p>
+    <w:p>
+      <w:pPr>
+        <w:pStyle w:val="Heading2"/>
+        <w:spacing w:after="160" w:before="280"/>
+      </w:pPr>
+      <w:r>
+        <w:t xml:space="preserve">10.4. Resolución de logos</w:t>
+      </w:r>
+    </w:p>
+    <w:p>
+      <w:pPr>
+        <w:spacing w:after="120"/>
+      </w:pPr>
+      <w:r>
+        <w:t xml:space="preserve">La resolución de logos se hace server-side por confiabilidad. Se prueban en cascada: DuckDuckGo icons → Google favicons → Clearbit → avatar con iniciales. La URL final se cachea 1 día.</w:t>
+      </w:r>
+    </w:p>
+    <w:p>
+      <w:pPr>
+        <w:pStyle w:val="Heading2"/>
+        <w:spacing w:after="160" w:before="280"/>
+      </w:pPr>
+      <w:r>
+        <w:t xml:space="preserve">10.5. Cómo se corre localmente</w:t>
+      </w:r>
+    </w:p>
+    <w:p>
+      <w:pPr>
+        <w:shd w:fill="F2F2F2" w:val="clear"/>
+        <w:spacing w:after="100" w:before="100"/>
+      </w:pPr>
+      <w:r>
+        <w:rPr>
+          <w:rFonts w:ascii="Courier New" w:cs="Courier New" w:eastAsia="Courier New" w:hAnsi="Courier New"/>
+          <w:sz w:val="20"/>
+          <w:szCs w:val="20"/>
+        </w:rPr>
+        <w:t xml:space="preserve">.venv/bin/python -m streamlit run dashboard.py</w:t>
+      </w:r>
+    </w:p>
+    <w:p>
+      <w:pPr>
+        <w:spacing w:after="120"/>
+      </w:pPr>
+      <w:r>
+        <w:t xml:space="preserve">Streamlit abre solo el navegador en http://localhost:8501.</w:t>
+      </w:r>
+    </w:p>
+    <w:p>
+      <w:pPr>
+        <w:pStyle w:val="Heading1"/>
+        <w:spacing w:after="200" w:before="360"/>
+      </w:pPr>
+      <w:r>
+        <w:t xml:space="preserve">11. Agente conversacional (Claude + tool use)</w:t>
+      </w:r>
+    </w:p>
+    <w:p>
+      <w:pPr>
+        <w:pStyle w:val="Heading2"/>
+        <w:spacing w:after="160" w:before="280"/>
+      </w:pPr>
+      <w:r>
+        <w:t xml:space="preserve">11.1. Qué hace</w:t>
+      </w:r>
+    </w:p>
+    <w:p>
+      <w:pPr>
+        <w:spacing w:after="120"/>
+      </w:pPr>
+      <w:r>
+        <w:t xml:space="preserve">Es un chat que responde preguntas sobre los datos en lenguaje natural. En lugar de que el usuario tenga que aprender los endpoints o SQL, formula la pregunta como se la haría a un colega, y el agente decide qué información consultar y cómo responder.</w:t>
+      </w:r>
+    </w:p>
+    <w:p>
+      <w:pPr>
+        <w:spacing w:after="120"/>
+      </w:pPr>
+      <w:r>
+        <w:t xml:space="preserve">Ejemplos de preguntas soportadas:</w:t>
+      </w:r>
+    </w:p>
+    <w:p>
+      <w:pPr>
+        <w:pStyle w:val="ListParagraph"/>
+        <w:numPr>
+          <w:ilvl w:val="0"/>
+          <w:numId w:val="2"/>
+        </w:numPr>
+        <w:spacing w:after="60"/>
+      </w:pPr>
+      <w:r>
+        <w:t xml:space="preserve">¿Qué empresas colombianas están disponibles?</w:t>
+      </w:r>
+    </w:p>
+    <w:p>
+      <w:pPr>
+        <w:pStyle w:val="ListParagraph"/>
+        <w:numPr>
+          <w:ilvl w:val="0"/>
+          <w:numId w:val="2"/>
+        </w:numPr>
+        <w:spacing w:after="60"/>
+      </w:pPr>
+      <w:r>
+        <w:t xml:space="preserve">¿Cuál fue la acción que más subió el último día?</w:t>
+      </w:r>
+    </w:p>
+    <w:p>
+      <w:pPr>
+        <w:pStyle w:val="ListParagraph"/>
+        <w:numPr>
+          <w:ilvl w:val="0"/>
+          <w:numId w:val="2"/>
+        </w:numPr>
+        <w:spacing w:after="60"/>
+      </w:pPr>
+      <w:r>
+        <w:t xml:space="preserve">Compara Apple con Microsoft en los últimos 90 días.</w:t>
+      </w:r>
+    </w:p>
+    <w:p>
+      <w:pPr>
+        <w:pStyle w:val="ListParagraph"/>
+        <w:numPr>
+          <w:ilvl w:val="0"/>
+          <w:numId w:val="2"/>
+        </w:numPr>
+        <w:spacing w:after="60"/>
+      </w:pPr>
+      <w:r>
+        <w:t xml:space="preserve">¿Cuál es la volatilidad de Tesla?</w:t>
+      </w:r>
+    </w:p>
+    <w:p>
+      <w:pPr>
+        <w:pStyle w:val="ListParagraph"/>
+        <w:numPr>
+          <w:ilvl w:val="0"/>
+          <w:numId w:val="2"/>
+        </w:numPr>
+        <w:spacing w:after="60"/>
+      </w:pPr>
+      <w:r>
+        <w:t xml:space="preserve">¿Qué precio tiene Ecopetrol en pesos vs dólares?</w:t>
+      </w:r>
+    </w:p>
+    <w:p>
+      <w:pPr>
+        <w:pStyle w:val="Heading2"/>
+        <w:spacing w:after="160" w:before="280"/>
+      </w:pPr>
+      <w:r>
+        <w:t xml:space="preserve">11.2. Cómo funciona (function calling / tool use)</w:t>
+      </w:r>
+    </w:p>
+    <w:p>
+      <w:pPr>
+        <w:pStyle w:val="ListParagraph"/>
+        <w:numPr>
+          <w:ilvl w:val="0"/>
+          <w:numId w:val="3"/>
+        </w:numPr>
+        <w:spacing w:after="60"/>
+      </w:pPr>
+      <w:r>
+        <w:t xml:space="preserve">El usuario escribe la pregunta en el chat.</w:t>
+      </w:r>
+    </w:p>
+    <w:p>
+      <w:pPr>
+        <w:pStyle w:val="ListParagraph"/>
+        <w:numPr>
+          <w:ilvl w:val="0"/>
+          <w:numId w:val="3"/>
+        </w:numPr>
+        <w:spacing w:after="60"/>
+      </w:pPr>
+      <w:r>
+        <w:t xml:space="preserve">Se envía a Claude con la lista de tools disponibles (una por endpoint de la API).</w:t>
+      </w:r>
+    </w:p>
+    <w:p>
+      <w:pPr>
+        <w:pStyle w:val="ListParagraph"/>
+        <w:numPr>
+          <w:ilvl w:val="0"/>
+          <w:numId w:val="3"/>
+        </w:numPr>
+        <w:spacing w:after="60"/>
+      </w:pPr>
+      <w:r>
+        <w:t xml:space="preserve">Claude decide qué tools llamar y con qué parámetros. Puede llamar varias en secuencia.</w:t>
+      </w:r>
+    </w:p>
+    <w:p>
+      <w:pPr>
+        <w:pStyle w:val="ListParagraph"/>
+        <w:numPr>
+          <w:ilvl w:val="0"/>
+          <w:numId w:val="3"/>
+        </w:numPr>
+        <w:spacing w:after="60"/>
+      </w:pPr>
+      <w:r>
+        <w:t xml:space="preserve">Cada llamada se ejecuta contra la API REST; se le devuelve el resultado al modelo.</w:t>
+      </w:r>
+    </w:p>
+    <w:p>
+      <w:pPr>
+        <w:pStyle w:val="ListParagraph"/>
+        <w:numPr>
+          <w:ilvl w:val="0"/>
+          <w:numId w:val="3"/>
+        </w:numPr>
+        <w:spacing w:after="60"/>
+      </w:pPr>
+      <w:r>
+        <w:t xml:space="preserve">Claude sintetiza una respuesta en lenguaje natural usando los datos reales.</w:t>
+      </w:r>
+    </w:p>
+    <w:p>
+      <w:pPr>
+        <w:spacing w:after="120"/>
+      </w:pPr>
+      <w:r>
+        <w:t xml:space="preserve">Esto garantiza que las respuestas siempre estén basadas en datos actuales del data warehouse; el modelo no inventa cifras.</w:t>
+      </w:r>
+    </w:p>
+    <w:p>
+      <w:pPr>
+        <w:pStyle w:val="Heading2"/>
+        <w:spacing w:after="160" w:before="280"/>
+      </w:pPr>
+      <w:r>
+        <w:t xml:space="preserve">11.3. Tools disponibles</w:t>
+      </w:r>
+    </w:p>
+    <w:p>
+      <w:pPr>
+        <w:spacing w:after="120"/>
+      </w:pPr>
+      <w:r>
+        <w:t xml:space="preserve">Cada endpoint de la API tiene una tool equivalente:</w:t>
+      </w:r>
+    </w:p>
+    <w:p>
+      <w:pPr>
+        <w:pStyle w:val="ListParagraph"/>
+        <w:numPr>
+          <w:ilvl w:val="0"/>
+          <w:numId w:val="2"/>
+        </w:numPr>
+        <w:spacing w:after="60"/>
+      </w:pPr>
+      <w:r>
+        <w:t xml:space="preserve">list_tickers, get_ticker_info</w:t>
+      </w:r>
+    </w:p>
+    <w:p>
+      <w:pPr>
+        <w:pStyle w:val="ListParagraph"/>
+        <w:numPr>
+          <w:ilvl w:val="0"/>
+          <w:numId w:val="2"/>
+        </w:numPr>
+        <w:spacing w:after="60"/>
+      </w:pPr>
+      <w:r>
+        <w:t xml:space="preserve">get_prices, get_intraday, get_metrics</w:t>
+      </w:r>
+    </w:p>
+    <w:p>
+      <w:pPr>
+        <w:pStyle w:val="ListParagraph"/>
+        <w:numPr>
+          <w:ilvl w:val="0"/>
+          <w:numId w:val="2"/>
+        </w:numPr>
+        <w:spacing w:after="60"/>
+      </w:pPr>
+      <w:r>
+        <w:t xml:space="preserve">get_top_movers, get_market_summary</w:t>
+      </w:r>
+    </w:p>
+    <w:p>
+      <w:pPr>
+        <w:pStyle w:val="Heading2"/>
+        <w:spacing w:after="160" w:before="280"/>
+      </w:pPr>
+      <w:r>
+        <w:t xml:space="preserve">11.4. Prompt caching</w:t>
+      </w:r>
+    </w:p>
+    <w:p>
+      <w:pPr>
+        <w:spacing w:after="120"/>
+      </w:pPr>
+      <w:r>
+        <w:t xml:space="preserve">Las definiciones de tools y el system prompt están marcadas con cache_control ephemeral. Después de la primera consulta, las siguientes dentro de 5 minutos son ~90% más baratas — Claude reutiliza el contexto cacheado en vez de reprocesarlo.</w:t>
+      </w:r>
+    </w:p>
+    <w:p>
+      <w:pPr>
+        <w:pStyle w:val="Heading2"/>
+        <w:spacing w:after="160" w:before="280"/>
+      </w:pPr>
+      <w:r>
+        <w:t xml:space="preserve">11.5. Modelo por defecto</w:t>
+      </w:r>
+    </w:p>
+    <w:p>
+      <w:pPr>
+        <w:spacing w:after="120"/>
+      </w:pPr>
+      <w:r>
+        <w:t xml:space="preserve">claude-sonnet-4-6 — balance óptimo calidad/costo para chat con function calling. Se puede cambiar con la env var CLAUDE_MODEL (ej. claude-haiku-4-5-20251001 para bajar costos).</w:t>
+      </w:r>
+    </w:p>
+    <w:p>
+      <w:pPr>
+        <w:pStyle w:val="Heading2"/>
+        <w:spacing w:after="160" w:before="280"/>
+      </w:pPr>
+      <w:r>
+        <w:t xml:space="preserve">11.6. Cómo se corre localmente</w:t>
+      </w:r>
+    </w:p>
+    <w:p>
+      <w:pPr>
+        <w:shd w:fill="F2F2F2" w:val="clear"/>
+        <w:spacing w:after="100" w:before="100"/>
+      </w:pPr>
+      <w:r>
+        <w:rPr>
+          <w:rFonts w:ascii="Courier New" w:cs="Courier New" w:eastAsia="Courier New" w:hAnsi="Courier New"/>
+          <w:sz w:val="20"/>
+          <w:szCs w:val="20"/>
+        </w:rPr>
+        <w:t xml:space="preserve">export ANTHROPIC_API_KEY="sk-ant-..."
+.venv/bin/python -m streamlit run dashboard.py</w:t>
+      </w:r>
+    </w:p>
+    <w:p>
+      <w:pPr>
+        <w:spacing w:after="120"/>
+      </w:pPr>
+      <w:r>
+        <w:t xml:space="preserve">Streamlit detecta automáticamente la carpeta pages/ y agrega la pestaña "🤖 Chat" en la barra lateral.</w:t>
+      </w:r>
+    </w:p>
+    <w:p>
+      <w:pPr>
+        <w:pStyle w:val="Heading1"/>
+        <w:spacing w:after="200" w:before="360"/>
+      </w:pPr>
+      <w:r>
+        <w:t xml:space="preserve">12. Seguridad y credenciales</w:t>
+      </w:r>
+    </w:p>
+    <w:p>
+      <w:pPr>
+        <w:pStyle w:val="Heading2"/>
+        <w:spacing w:after="160" w:before="280"/>
+      </w:pPr>
+      <w:r>
+        <w:t xml:space="preserve">12.1. Service Account de GCP</w:t>
+      </w:r>
+    </w:p>
+    <w:p>
+      <w:pPr>
+        <w:spacing w:after="120"/>
+      </w:pPr>
+      <w:r>
+        <w:t xml:space="preserve">El pipeline usa una service account (stock-etl-bot) con permisos mínimos: bigquery.dataEditor, bigquery.jobUser, storage.objectAdmin. Se autentica con un archivo key.json descargado desde GCP.</w:t>
+      </w:r>
+    </w:p>
+    <w:p>
+      <w:pPr>
+        <w:pStyle w:val="Heading2"/>
+        <w:spacing w:after="160" w:before="280"/>
+      </w:pPr>
+      <w:r>
+        <w:t xml:space="preserve">12.2. Credenciales en GitHub</w:t>
       </w:r>
     </w:p>
     <w:tbl>
@@ -5605,19 +6620,11 @@
     </w:tbl>
     <w:p>
       <w:pPr>
-        <w:spacing w:after="120"/>
-      </w:pPr>
-      <w:r>
-        <w:t xml:space="preserve">Los secretos solo se desencriptan dentro del contexto del workflow, en runtime. Ni siquiera el dueño del repo puede leerlos desde la web una vez guardados.</w:t>
-      </w:r>
-    </w:p>
-    <w:p>
-      <w:pPr>
         <w:pStyle w:val="Heading2"/>
         <w:spacing w:after="160" w:before="280"/>
       </w:pPr>
       <w:r>
-        <w:t xml:space="preserve">9.4. Rotación de credenciales</w:t>
+        <w:t xml:space="preserve">12.3. Anthropic API Key</w:t>
       </w:r>
     </w:p>
     <w:p>
@@ -5625,7 +6632,72 @@
         <w:spacing w:after="120"/>
       </w:pPr>
       <w:r>
-        <w:t xml:space="preserve">Si la key se compromete, el procedimiento es:</w:t>
+        <w:t xml:space="preserve">Se usa una API key personal de Anthropic para el agente conversacional. NO se guarda en el repo. Se pasa por env var (ANTHROPIC_API_KEY) o mediante el archivo .streamlit/secrets.toml (que sí debe estar en .gitignore).</w:t>
+      </w:r>
+    </w:p>
+    <w:p>
+      <w:pPr>
+        <w:pStyle w:val="Heading2"/>
+        <w:spacing w:after="160" w:before="280"/>
+      </w:pPr>
+      <w:r>
+        <w:t xml:space="preserve">12.4. Archivos sensibles ignorados por git</w:t>
+      </w:r>
+    </w:p>
+    <w:p>
+      <w:pPr>
+        <w:pStyle w:val="ListParagraph"/>
+        <w:numPr>
+          <w:ilvl w:val="0"/>
+          <w:numId w:val="2"/>
+        </w:numPr>
+        <w:spacing w:after="60"/>
+      </w:pPr>
+      <w:r>
+        <w:t xml:space="preserve">key.json — credencial de la SA de GCP.</w:t>
+      </w:r>
+    </w:p>
+    <w:p>
+      <w:pPr>
+        <w:pStyle w:val="ListParagraph"/>
+        <w:numPr>
+          <w:ilvl w:val="0"/>
+          <w:numId w:val="2"/>
+        </w:numPr>
+        <w:spacing w:after="60"/>
+      </w:pPr>
+      <w:r>
+        <w:t xml:space="preserve">.streamlit/secrets.toml — API keys de servicios externos.</w:t>
+      </w:r>
+    </w:p>
+    <w:p>
+      <w:pPr>
+        <w:pStyle w:val="ListParagraph"/>
+        <w:numPr>
+          <w:ilvl w:val="0"/>
+          <w:numId w:val="2"/>
+        </w:numPr>
+        <w:spacing w:after="60"/>
+      </w:pPr>
+      <w:r>
+        <w:t xml:space="preserve">.venv/ — entorno virtual de Python.</w:t>
+      </w:r>
+    </w:p>
+    <w:p>
+      <w:pPr>
+        <w:pStyle w:val="Heading2"/>
+        <w:spacing w:after="160" w:before="280"/>
+      </w:pPr>
+      <w:r>
+        <w:t xml:space="preserve">12.5. Rotación de credenciales</w:t>
+      </w:r>
+    </w:p>
+    <w:p>
+      <w:pPr>
+        <w:spacing w:after="120"/>
+      </w:pPr>
+      <w:r>
+        <w:t xml:space="preserve">Si una credencial se compromete:</w:t>
       </w:r>
     </w:p>
     <w:p>
@@ -5638,7 +6710,7 @@
         <w:spacing w:after="60"/>
       </w:pPr>
       <w:r>
-        <w:t xml:space="preserve">Revocar la key vieja en GCP: gcloud iam service-accounts keys delete ...</w:t>
+        <w:t xml:space="preserve">Revocar la key vieja en su consola (GCP, Anthropic, etc.).</w:t>
       </w:r>
     </w:p>
     <w:p>
@@ -5651,7 +6723,7 @@
         <w:spacing w:after="60"/>
       </w:pPr>
       <w:r>
-        <w:t xml:space="preserve">Generar una nueva: gcloud iam service-accounts keys create key.json ...</w:t>
+        <w:t xml:space="preserve">Generar una nueva.</w:t>
       </w:r>
     </w:p>
     <w:p>
@@ -5664,7 +6736,7 @@
         <w:spacing w:after="60"/>
       </w:pPr>
       <w:r>
-        <w:t xml:space="preserve">Actualizar el secret en GitHub: gh secret set GCP_SA_KEY &lt; key.json</w:t>
+        <w:t xml:space="preserve">Actualizar el secret en GitHub o el archivo local correspondiente.</w:t>
       </w:r>
     </w:p>
     <w:p>
@@ -5673,7 +6745,7 @@
         <w:spacing w:after="200" w:before="360"/>
       </w:pPr>
       <w:r>
-        <w:t xml:space="preserve">10. Consideraciones importantes</w:t>
+        <w:t xml:space="preserve">13. Consideraciones importantes</w:t>
       </w:r>
     </w:p>
     <w:p>
@@ -5682,7 +6754,7 @@
         <w:spacing w:after="160" w:before="280"/>
       </w:pPr>
       <w:r>
-        <w:t xml:space="preserve">10.1. Limitaciones de Yahoo Finance</w:t>
+        <w:t xml:space="preserve">13.1. Limitaciones de Yahoo Finance</w:t>
       </w:r>
     </w:p>
     <w:p>
@@ -5695,7 +6767,7 @@
         <w:spacing w:after="60"/>
       </w:pPr>
       <w:r>
-        <w:t xml:space="preserve">Datos horarios (interval=1h): solo últimos ~730 días de historia.</w:t>
+        <w:t xml:space="preserve">Datos horarios: solo últimos ~730 días.</w:t>
       </w:r>
     </w:p>
     <w:p>
@@ -5708,7 +6780,7 @@
         <w:spacing w:after="60"/>
       </w:pPr>
       <w:r>
-        <w:t xml:space="preserve">Datos por minuto: solo últimos 7 días (no se usa en este proyecto).</w:t>
+        <w:t xml:space="preserve">Datos por minuto: solo últimos 7 días (no usados en este proyecto).</w:t>
       </w:r>
     </w:p>
     <w:p>
@@ -5721,7 +6793,7 @@
         <w:spacing w:after="60"/>
       </w:pPr>
       <w:r>
-        <w:t xml:space="preserve">Cobertura de la BVC: incompleta para tickers .CL en intraday; algunos no devuelven datos.</w:t>
+        <w:t xml:space="preserve">Algunos tickers de la BVC están delistados de Yahoo (ej. BCOLOMBIA.CL, PFBCOLOM.CL). El dashboard muestra un aviso cuando ocurre.</w:t>
       </w:r>
     </w:p>
     <w:p>
@@ -5734,7 +6806,7 @@
         <w:spacing w:after="60"/>
       </w:pPr>
       <w:r>
-        <w:t xml:space="preserve">No es una API oficial: puede cambiar sin aviso. yfinance mitiga esto pero no lo elimina.</w:t>
+        <w:t xml:space="preserve">No es una API oficial: puede cambiar sin aviso.</w:t>
       </w:r>
     </w:p>
     <w:p>
@@ -5743,7 +6815,7 @@
         <w:spacing w:after="160" w:before="280"/>
       </w:pPr>
       <w:r>
-        <w:t xml:space="preserve">10.2. Divergencia de monedas</w:t>
+        <w:t xml:space="preserve">13.2. Divergencia de monedas</w:t>
       </w:r>
     </w:p>
     <w:p>
@@ -5751,7 +6823,7 @@
         <w:spacing w:after="120"/>
       </w:pPr>
       <w:r>
-        <w:t xml:space="preserve">Los precios están en la moneda nativa del ticker: USD para ADRs y empresas gringas, COP para BVC. Comparar directamente Close entre un ADR y un BVC no tiene sentido a menos que se aplique una conversión de tasa de cambio (fuera del alcance actual).</w:t>
+        <w:t xml:space="preserve">Los precios están en la moneda nativa del ticker: USD para ADRs y empresas gringas, COP para BVC. Comparar precios entre monedas sin conversión no tiene sentido.</w:t>
       </w:r>
     </w:p>
     <w:p>
@@ -5760,7 +6832,7 @@
         <w:spacing w:after="100" w:before="100"/>
       </w:pPr>
       <w:r>
-        <w:t xml:space="preserve">⚠ La columna Currency en tickers_dim indica siempre en qué moneda está cada ticker. Usarla en JOINs antes de comparar precios.</w:t>
+        <w:t xml:space="preserve">⚠ La columna Currency en tickers_dim indica siempre en qué moneda está cada ticker. El agente conversacional considera esto automáticamente en sus respuestas.</w:t>
       </w:r>
     </w:p>
     <w:p>
@@ -5769,7 +6841,7 @@
         <w:spacing w:after="160" w:before="280"/>
       </w:pPr>
       <w:r>
-        <w:t xml:space="preserve">10.3. Zonas horarias</w:t>
+        <w:t xml:space="preserve">13.3. Zonas horarias</w:t>
       </w:r>
     </w:p>
     <w:p>
@@ -5777,7 +6849,7 @@
         <w:spacing w:after="120"/>
       </w:pPr>
       <w:r>
-        <w:t xml:space="preserve">Todos los timestamps en las tablas están en UTC (estándar universal). Para leer en hora Colombia, usar las vistas (Timestamp_COT) o convertir en el query: DATETIME(Timestamp, "America/Bogota").</w:t>
+        <w:t xml:space="preserve">Todos los timestamps en storage están en UTC. Las vistas *_view los convierten a hora Colombia.</w:t>
       </w:r>
     </w:p>
     <w:p>
@@ -5786,7 +6858,7 @@
         <w:spacing w:after="160" w:before="280"/>
       </w:pPr>
       <w:r>
-        <w:t xml:space="preserve">10.4. Datos del día actual</w:t>
+        <w:t xml:space="preserve">13.4. Datos del día actual</w:t>
       </w:r>
     </w:p>
     <w:p>
@@ -5794,7 +6866,24 @@
         <w:spacing w:after="120"/>
       </w:pPr>
       <w:r>
-        <w:t xml:space="preserve">Yahoo publica los datos del día ~15-30 minutos después del cierre. Como el cron corre a las 5 p.m. Colombia (posterior al cierre de todas las bolsas relevantes), los datos del día actual siempre están disponibles en la corrida diaria.</w:t>
+        <w:t xml:space="preserve">Yahoo publica los datos del día ~15-30 min después del cierre. El cron a las 5 PM COT garantiza que los datos del día ya están disponibles.</w:t>
+      </w:r>
+    </w:p>
+    <w:p>
+      <w:pPr>
+        <w:pStyle w:val="Heading2"/>
+        <w:spacing w:after="160" w:before="280"/>
+      </w:pPr>
+      <w:r>
+        <w:t xml:space="preserve">13.5. Costos del agente LLM</w:t>
+      </w:r>
+    </w:p>
+    <w:p>
+      <w:pPr>
+        <w:spacing w:after="120"/>
+      </w:pPr>
+      <w:r>
+        <w:t xml:space="preserve">Anthropic cobra por tokens procesados. Con caching activado, una conversación típica cuesta fracciones de centavo. Un budget de $5 en la consola dura muchísimo para uso personal.</w:t>
       </w:r>
     </w:p>
     <w:p>
@@ -5803,7 +6892,7 @@
         <w:spacing w:after="200" w:before="360"/>
       </w:pPr>
       <w:r>
-        <w:t xml:space="preserve">11. Glosario</w:t>
+        <w:t xml:space="preserve">14. Glosario</w:t>
       </w:r>
     </w:p>
     <w:tbl>
@@ -5941,7 +7030,7 @@
                 <w:sz w:val="20"/>
                 <w:szCs w:val="20"/>
               </w:rPr>
-              <w:t xml:space="preserve">Código bursátil único de una acción (ej. AAPL = Apple, EC = Ecopetrol).</w:t>
+              <w:t xml:space="preserve">Código bursátil único de una acción (ej. AAPL, EC).</w:t>
             </w:r>
           </w:p>
         </w:tc>
@@ -6127,7 +7216,7 @@
                 <w:sz w:val="20"/>
                 <w:szCs w:val="20"/>
               </w:rPr>
-              <w:t xml:space="preserve">Base de datos optimizada para análisis (queries complejas sobre historia).</w:t>
+              <w:t xml:space="preserve">Base de datos optimizada para análisis.</w:t>
             </w:r>
           </w:p>
         </w:tc>
@@ -6189,7 +7278,7 @@
                 <w:sz w:val="20"/>
                 <w:szCs w:val="20"/>
               </w:rPr>
-              <w:t xml:space="preserve">Tabla con eventos o mediciones que cambian frecuentemente (ej. precios diarios).</w:t>
+              <w:t xml:space="preserve">Tabla con eventos o mediciones (ej. precios diarios).</w:t>
             </w:r>
           </w:p>
         </w:tc>
@@ -6375,7 +7464,7 @@
                 <w:sz w:val="20"/>
                 <w:szCs w:val="20"/>
               </w:rPr>
-              <w:t xml:space="preserve">American Depositary Receipt: acción de empresa extranjera que cotiza en bolsas de USA.</w:t>
+              <w:t xml:space="preserve">American Depositary Receipt: acción de empresa extranjera cotizando en USA.</w:t>
             </w:r>
           </w:p>
         </w:tc>
@@ -6623,7 +7712,7 @@
                 <w:sz w:val="20"/>
                 <w:szCs w:val="20"/>
               </w:rPr>
-              <w:t xml:space="preserve">Formato para expresar horarios recurrentes (ej. "0 22 * * *" = todos los días a las 22:00).</w:t>
+              <w:t xml:space="preserve">Formato para expresar horarios recurrentes (ej. '0 22 * * *').</w:t>
             </w:r>
           </w:p>
         </w:tc>
@@ -6717,7 +7806,7 @@
                 <w:sz w:val="20"/>
                 <w:szCs w:val="20"/>
               </w:rPr>
-              <w:t xml:space="preserve">Backfill</w:t>
+              <w:t xml:space="preserve">API REST</w:t>
             </w:r>
           </w:p>
         </w:tc>
@@ -6747,7 +7836,7 @@
                 <w:sz w:val="20"/>
                 <w:szCs w:val="20"/>
               </w:rPr>
-              <w:t xml:space="preserve">Carga masiva de datos históricos, típicamente ejecutada una sola vez.</w:t>
+              <w:t xml:space="preserve">Interfaz web para consultar datos vía URLs (HTTP + JSON).</w:t>
             </w:r>
           </w:p>
         </w:tc>
@@ -6779,7 +7868,7 @@
                 <w:sz w:val="20"/>
                 <w:szCs w:val="20"/>
               </w:rPr>
-              <w:t xml:space="preserve">Volatilidad</w:t>
+              <w:t xml:space="preserve">Endpoint</w:t>
             </w:r>
           </w:p>
         </w:tc>
@@ -6809,7 +7898,7 @@
                 <w:sz w:val="20"/>
                 <w:szCs w:val="20"/>
               </w:rPr>
-              <w:t xml:space="preserve">Medida de qué tanto varía un precio; matemáticamente, desviación estándar de retornos.</w:t>
+              <w:t xml:space="preserve">URL específica de una API con una función definida (ej. /tickers).</w:t>
             </w:r>
           </w:p>
         </w:tc>
@@ -6841,6 +7930,564 @@
                 <w:sz w:val="20"/>
                 <w:szCs w:val="20"/>
               </w:rPr>
+              <w:t xml:space="preserve">Swagger UI</w:t>
+            </w:r>
+          </w:p>
+        </w:tc>
+        <w:tc>
+          <w:tcPr>
+            <w:tcW w:type="dxa" w:w="6960"/>
+            <w:tcBorders>
+              <w:top w:val="single" w:color="BFBFBF" w:sz="1"/>
+              <w:left w:val="single" w:color="BFBFBF" w:sz="1"/>
+              <w:bottom w:val="single" w:color="BFBFBF" w:sz="1"/>
+              <w:right w:val="single" w:color="BFBFBF" w:sz="1"/>
+            </w:tcBorders>
+            <w:shd w:fill="F7F9FC" w:val="clear"/>
+            <w:tcMar>
+              <w:top w:type="dxa" w:w="80"/>
+              <w:left w:type="dxa" w:w="120"/>
+              <w:bottom w:type="dxa" w:w="80"/>
+              <w:right w:type="dxa" w:w="120"/>
+            </w:tcMar>
+          </w:tcPr>
+          <w:p>
+            <w:r>
+              <w:rPr>
+                <w:b w:val="false"/>
+                <w:bCs w:val="false"/>
+                <w:color w:val="000000"/>
+                <w:sz w:val="20"/>
+                <w:szCs w:val="20"/>
+              </w:rPr>
+              <w:t xml:space="preserve">Interfaz gráfica auto-generada por FastAPI para probar endpoints.</w:t>
+            </w:r>
+          </w:p>
+        </w:tc>
+      </w:tr>
+      <w:tr>
+        <w:tc>
+          <w:tcPr>
+            <w:tcW w:type="dxa" w:w="2400"/>
+            <w:tcBorders>
+              <w:top w:val="single" w:color="BFBFBF" w:sz="1"/>
+              <w:left w:val="single" w:color="BFBFBF" w:sz="1"/>
+              <w:bottom w:val="single" w:color="BFBFBF" w:sz="1"/>
+              <w:right w:val="single" w:color="BFBFBF" w:sz="1"/>
+            </w:tcBorders>
+            <w:shd w:fill="FFFFFF" w:val="clear"/>
+            <w:tcMar>
+              <w:top w:type="dxa" w:w="80"/>
+              <w:left w:type="dxa" w:w="120"/>
+              <w:bottom w:type="dxa" w:w="80"/>
+              <w:right w:type="dxa" w:w="120"/>
+            </w:tcMar>
+          </w:tcPr>
+          <w:p>
+            <w:r>
+              <w:rPr>
+                <w:b w:val="false"/>
+                <w:bCs w:val="false"/>
+                <w:color w:val="000000"/>
+                <w:sz w:val="20"/>
+                <w:szCs w:val="20"/>
+              </w:rPr>
+              <w:t xml:space="preserve">FastAPI</w:t>
+            </w:r>
+          </w:p>
+        </w:tc>
+        <w:tc>
+          <w:tcPr>
+            <w:tcW w:type="dxa" w:w="6960"/>
+            <w:tcBorders>
+              <w:top w:val="single" w:color="BFBFBF" w:sz="1"/>
+              <w:left w:val="single" w:color="BFBFBF" w:sz="1"/>
+              <w:bottom w:val="single" w:color="BFBFBF" w:sz="1"/>
+              <w:right w:val="single" w:color="BFBFBF" w:sz="1"/>
+            </w:tcBorders>
+            <w:shd w:fill="FFFFFF" w:val="clear"/>
+            <w:tcMar>
+              <w:top w:type="dxa" w:w="80"/>
+              <w:left w:type="dxa" w:w="120"/>
+              <w:bottom w:type="dxa" w:w="80"/>
+              <w:right w:type="dxa" w:w="120"/>
+            </w:tcMar>
+          </w:tcPr>
+          <w:p>
+            <w:r>
+              <w:rPr>
+                <w:b w:val="false"/>
+                <w:bCs w:val="false"/>
+                <w:color w:val="000000"/>
+                <w:sz w:val="20"/>
+                <w:szCs w:val="20"/>
+              </w:rPr>
+              <w:t xml:space="preserve">Framework Python para construir APIs REST.</w:t>
+            </w:r>
+          </w:p>
+        </w:tc>
+      </w:tr>
+      <w:tr>
+        <w:tc>
+          <w:tcPr>
+            <w:tcW w:type="dxa" w:w="2400"/>
+            <w:tcBorders>
+              <w:top w:val="single" w:color="BFBFBF" w:sz="1"/>
+              <w:left w:val="single" w:color="BFBFBF" w:sz="1"/>
+              <w:bottom w:val="single" w:color="BFBFBF" w:sz="1"/>
+              <w:right w:val="single" w:color="BFBFBF" w:sz="1"/>
+            </w:tcBorders>
+            <w:shd w:fill="F7F9FC" w:val="clear"/>
+            <w:tcMar>
+              <w:top w:type="dxa" w:w="80"/>
+              <w:left w:type="dxa" w:w="120"/>
+              <w:bottom w:type="dxa" w:w="80"/>
+              <w:right w:type="dxa" w:w="120"/>
+            </w:tcMar>
+          </w:tcPr>
+          <w:p>
+            <w:r>
+              <w:rPr>
+                <w:b w:val="false"/>
+                <w:bCs w:val="false"/>
+                <w:color w:val="000000"/>
+                <w:sz w:val="20"/>
+                <w:szCs w:val="20"/>
+              </w:rPr>
+              <w:t xml:space="preserve">uvicorn</w:t>
+            </w:r>
+          </w:p>
+        </w:tc>
+        <w:tc>
+          <w:tcPr>
+            <w:tcW w:type="dxa" w:w="6960"/>
+            <w:tcBorders>
+              <w:top w:val="single" w:color="BFBFBF" w:sz="1"/>
+              <w:left w:val="single" w:color="BFBFBF" w:sz="1"/>
+              <w:bottom w:val="single" w:color="BFBFBF" w:sz="1"/>
+              <w:right w:val="single" w:color="BFBFBF" w:sz="1"/>
+            </w:tcBorders>
+            <w:shd w:fill="F7F9FC" w:val="clear"/>
+            <w:tcMar>
+              <w:top w:type="dxa" w:w="80"/>
+              <w:left w:type="dxa" w:w="120"/>
+              <w:bottom w:type="dxa" w:w="80"/>
+              <w:right w:type="dxa" w:w="120"/>
+            </w:tcMar>
+          </w:tcPr>
+          <w:p>
+            <w:r>
+              <w:rPr>
+                <w:b w:val="false"/>
+                <w:bCs w:val="false"/>
+                <w:color w:val="000000"/>
+                <w:sz w:val="20"/>
+                <w:szCs w:val="20"/>
+              </w:rPr>
+              <w:t xml:space="preserve">Servidor ASGI que ejecuta apps FastAPI.</w:t>
+            </w:r>
+          </w:p>
+        </w:tc>
+      </w:tr>
+      <w:tr>
+        <w:tc>
+          <w:tcPr>
+            <w:tcW w:type="dxa" w:w="2400"/>
+            <w:tcBorders>
+              <w:top w:val="single" w:color="BFBFBF" w:sz="1"/>
+              <w:left w:val="single" w:color="BFBFBF" w:sz="1"/>
+              <w:bottom w:val="single" w:color="BFBFBF" w:sz="1"/>
+              <w:right w:val="single" w:color="BFBFBF" w:sz="1"/>
+            </w:tcBorders>
+            <w:shd w:fill="FFFFFF" w:val="clear"/>
+            <w:tcMar>
+              <w:top w:type="dxa" w:w="80"/>
+              <w:left w:type="dxa" w:w="120"/>
+              <w:bottom w:type="dxa" w:w="80"/>
+              <w:right w:type="dxa" w:w="120"/>
+            </w:tcMar>
+          </w:tcPr>
+          <w:p>
+            <w:r>
+              <w:rPr>
+                <w:b w:val="false"/>
+                <w:bCs w:val="false"/>
+                <w:color w:val="000000"/>
+                <w:sz w:val="20"/>
+                <w:szCs w:val="20"/>
+              </w:rPr>
+              <w:t xml:space="preserve">Streamlit</w:t>
+            </w:r>
+          </w:p>
+        </w:tc>
+        <w:tc>
+          <w:tcPr>
+            <w:tcW w:type="dxa" w:w="6960"/>
+            <w:tcBorders>
+              <w:top w:val="single" w:color="BFBFBF" w:sz="1"/>
+              <w:left w:val="single" w:color="BFBFBF" w:sz="1"/>
+              <w:bottom w:val="single" w:color="BFBFBF" w:sz="1"/>
+              <w:right w:val="single" w:color="BFBFBF" w:sz="1"/>
+            </w:tcBorders>
+            <w:shd w:fill="FFFFFF" w:val="clear"/>
+            <w:tcMar>
+              <w:top w:type="dxa" w:w="80"/>
+              <w:left w:type="dxa" w:w="120"/>
+              <w:bottom w:type="dxa" w:w="80"/>
+              <w:right w:type="dxa" w:w="120"/>
+            </w:tcMar>
+          </w:tcPr>
+          <w:p>
+            <w:r>
+              <w:rPr>
+                <w:b w:val="false"/>
+                <w:bCs w:val="false"/>
+                <w:color w:val="000000"/>
+                <w:sz w:val="20"/>
+                <w:szCs w:val="20"/>
+              </w:rPr>
+              <w:t xml:space="preserve">Framework Python para construir dashboards y apps web.</w:t>
+            </w:r>
+          </w:p>
+        </w:tc>
+      </w:tr>
+      <w:tr>
+        <w:tc>
+          <w:tcPr>
+            <w:tcW w:type="dxa" w:w="2400"/>
+            <w:tcBorders>
+              <w:top w:val="single" w:color="BFBFBF" w:sz="1"/>
+              <w:left w:val="single" w:color="BFBFBF" w:sz="1"/>
+              <w:bottom w:val="single" w:color="BFBFBF" w:sz="1"/>
+              <w:right w:val="single" w:color="BFBFBF" w:sz="1"/>
+            </w:tcBorders>
+            <w:shd w:fill="F7F9FC" w:val="clear"/>
+            <w:tcMar>
+              <w:top w:type="dxa" w:w="80"/>
+              <w:left w:type="dxa" w:w="120"/>
+              <w:bottom w:type="dxa" w:w="80"/>
+              <w:right w:type="dxa" w:w="120"/>
+            </w:tcMar>
+          </w:tcPr>
+          <w:p>
+            <w:r>
+              <w:rPr>
+                <w:b w:val="false"/>
+                <w:bCs w:val="false"/>
+                <w:color w:val="000000"/>
+                <w:sz w:val="20"/>
+                <w:szCs w:val="20"/>
+              </w:rPr>
+              <w:t xml:space="preserve">LLM</w:t>
+            </w:r>
+          </w:p>
+        </w:tc>
+        <w:tc>
+          <w:tcPr>
+            <w:tcW w:type="dxa" w:w="6960"/>
+            <w:tcBorders>
+              <w:top w:val="single" w:color="BFBFBF" w:sz="1"/>
+              <w:left w:val="single" w:color="BFBFBF" w:sz="1"/>
+              <w:bottom w:val="single" w:color="BFBFBF" w:sz="1"/>
+              <w:right w:val="single" w:color="BFBFBF" w:sz="1"/>
+            </w:tcBorders>
+            <w:shd w:fill="F7F9FC" w:val="clear"/>
+            <w:tcMar>
+              <w:top w:type="dxa" w:w="80"/>
+              <w:left w:type="dxa" w:w="120"/>
+              <w:bottom w:type="dxa" w:w="80"/>
+              <w:right w:type="dxa" w:w="120"/>
+            </w:tcMar>
+          </w:tcPr>
+          <w:p>
+            <w:r>
+              <w:rPr>
+                <w:b w:val="false"/>
+                <w:bCs w:val="false"/>
+                <w:color w:val="000000"/>
+                <w:sz w:val="20"/>
+                <w:szCs w:val="20"/>
+              </w:rPr>
+              <w:t xml:space="preserve">Large Language Model — modelo de IA que procesa lenguaje natural.</w:t>
+            </w:r>
+          </w:p>
+        </w:tc>
+      </w:tr>
+      <w:tr>
+        <w:tc>
+          <w:tcPr>
+            <w:tcW w:type="dxa" w:w="2400"/>
+            <w:tcBorders>
+              <w:top w:val="single" w:color="BFBFBF" w:sz="1"/>
+              <w:left w:val="single" w:color="BFBFBF" w:sz="1"/>
+              <w:bottom w:val="single" w:color="BFBFBF" w:sz="1"/>
+              <w:right w:val="single" w:color="BFBFBF" w:sz="1"/>
+            </w:tcBorders>
+            <w:shd w:fill="FFFFFF" w:val="clear"/>
+            <w:tcMar>
+              <w:top w:type="dxa" w:w="80"/>
+              <w:left w:type="dxa" w:w="120"/>
+              <w:bottom w:type="dxa" w:w="80"/>
+              <w:right w:type="dxa" w:w="120"/>
+            </w:tcMar>
+          </w:tcPr>
+          <w:p>
+            <w:r>
+              <w:rPr>
+                <w:b w:val="false"/>
+                <w:bCs w:val="false"/>
+                <w:color w:val="000000"/>
+                <w:sz w:val="20"/>
+                <w:szCs w:val="20"/>
+              </w:rPr>
+              <w:t xml:space="preserve">Function calling / Tool use</w:t>
+            </w:r>
+          </w:p>
+        </w:tc>
+        <w:tc>
+          <w:tcPr>
+            <w:tcW w:type="dxa" w:w="6960"/>
+            <w:tcBorders>
+              <w:top w:val="single" w:color="BFBFBF" w:sz="1"/>
+              <w:left w:val="single" w:color="BFBFBF" w:sz="1"/>
+              <w:bottom w:val="single" w:color="BFBFBF" w:sz="1"/>
+              <w:right w:val="single" w:color="BFBFBF" w:sz="1"/>
+            </w:tcBorders>
+            <w:shd w:fill="FFFFFF" w:val="clear"/>
+            <w:tcMar>
+              <w:top w:type="dxa" w:w="80"/>
+              <w:left w:type="dxa" w:w="120"/>
+              <w:bottom w:type="dxa" w:w="80"/>
+              <w:right w:type="dxa" w:w="120"/>
+            </w:tcMar>
+          </w:tcPr>
+          <w:p>
+            <w:r>
+              <w:rPr>
+                <w:b w:val="false"/>
+                <w:bCs w:val="false"/>
+                <w:color w:val="000000"/>
+                <w:sz w:val="20"/>
+                <w:szCs w:val="20"/>
+              </w:rPr>
+              <w:t xml:space="preserve">Capacidad del LLM de invocar funciones externas y usar sus resultados.</w:t>
+            </w:r>
+          </w:p>
+        </w:tc>
+      </w:tr>
+      <w:tr>
+        <w:tc>
+          <w:tcPr>
+            <w:tcW w:type="dxa" w:w="2400"/>
+            <w:tcBorders>
+              <w:top w:val="single" w:color="BFBFBF" w:sz="1"/>
+              <w:left w:val="single" w:color="BFBFBF" w:sz="1"/>
+              <w:bottom w:val="single" w:color="BFBFBF" w:sz="1"/>
+              <w:right w:val="single" w:color="BFBFBF" w:sz="1"/>
+            </w:tcBorders>
+            <w:shd w:fill="F7F9FC" w:val="clear"/>
+            <w:tcMar>
+              <w:top w:type="dxa" w:w="80"/>
+              <w:left w:type="dxa" w:w="120"/>
+              <w:bottom w:type="dxa" w:w="80"/>
+              <w:right w:type="dxa" w:w="120"/>
+            </w:tcMar>
+          </w:tcPr>
+          <w:p>
+            <w:r>
+              <w:rPr>
+                <w:b w:val="false"/>
+                <w:bCs w:val="false"/>
+                <w:color w:val="000000"/>
+                <w:sz w:val="20"/>
+                <w:szCs w:val="20"/>
+              </w:rPr>
+              <w:t xml:space="preserve">Prompt caching</w:t>
+            </w:r>
+          </w:p>
+        </w:tc>
+        <w:tc>
+          <w:tcPr>
+            <w:tcW w:type="dxa" w:w="6960"/>
+            <w:tcBorders>
+              <w:top w:val="single" w:color="BFBFBF" w:sz="1"/>
+              <w:left w:val="single" w:color="BFBFBF" w:sz="1"/>
+              <w:bottom w:val="single" w:color="BFBFBF" w:sz="1"/>
+              <w:right w:val="single" w:color="BFBFBF" w:sz="1"/>
+            </w:tcBorders>
+            <w:shd w:fill="F7F9FC" w:val="clear"/>
+            <w:tcMar>
+              <w:top w:type="dxa" w:w="80"/>
+              <w:left w:type="dxa" w:w="120"/>
+              <w:bottom w:type="dxa" w:w="80"/>
+              <w:right w:type="dxa" w:w="120"/>
+            </w:tcMar>
+          </w:tcPr>
+          <w:p>
+            <w:r>
+              <w:rPr>
+                <w:b w:val="false"/>
+                <w:bCs w:val="false"/>
+                <w:color w:val="000000"/>
+                <w:sz w:val="20"/>
+                <w:szCs w:val="20"/>
+              </w:rPr>
+              <w:t xml:space="preserve">Cachear el contexto estático (system prompt, tools) para bajar costos.</w:t>
+            </w:r>
+          </w:p>
+        </w:tc>
+      </w:tr>
+      <w:tr>
+        <w:tc>
+          <w:tcPr>
+            <w:tcW w:type="dxa" w:w="2400"/>
+            <w:tcBorders>
+              <w:top w:val="single" w:color="BFBFBF" w:sz="1"/>
+              <w:left w:val="single" w:color="BFBFBF" w:sz="1"/>
+              <w:bottom w:val="single" w:color="BFBFBF" w:sz="1"/>
+              <w:right w:val="single" w:color="BFBFBF" w:sz="1"/>
+            </w:tcBorders>
+            <w:shd w:fill="FFFFFF" w:val="clear"/>
+            <w:tcMar>
+              <w:top w:type="dxa" w:w="80"/>
+              <w:left w:type="dxa" w:w="120"/>
+              <w:bottom w:type="dxa" w:w="80"/>
+              <w:right w:type="dxa" w:w="120"/>
+            </w:tcMar>
+          </w:tcPr>
+          <w:p>
+            <w:r>
+              <w:rPr>
+                <w:b w:val="false"/>
+                <w:bCs w:val="false"/>
+                <w:color w:val="000000"/>
+                <w:sz w:val="20"/>
+                <w:szCs w:val="20"/>
+              </w:rPr>
+              <w:t xml:space="preserve">Backfill</w:t>
+            </w:r>
+          </w:p>
+        </w:tc>
+        <w:tc>
+          <w:tcPr>
+            <w:tcW w:type="dxa" w:w="6960"/>
+            <w:tcBorders>
+              <w:top w:val="single" w:color="BFBFBF" w:sz="1"/>
+              <w:left w:val="single" w:color="BFBFBF" w:sz="1"/>
+              <w:bottom w:val="single" w:color="BFBFBF" w:sz="1"/>
+              <w:right w:val="single" w:color="BFBFBF" w:sz="1"/>
+            </w:tcBorders>
+            <w:shd w:fill="FFFFFF" w:val="clear"/>
+            <w:tcMar>
+              <w:top w:type="dxa" w:w="80"/>
+              <w:left w:type="dxa" w:w="120"/>
+              <w:bottom w:type="dxa" w:w="80"/>
+              <w:right w:type="dxa" w:w="120"/>
+            </w:tcMar>
+          </w:tcPr>
+          <w:p>
+            <w:r>
+              <w:rPr>
+                <w:b w:val="false"/>
+                <w:bCs w:val="false"/>
+                <w:color w:val="000000"/>
+                <w:sz w:val="20"/>
+                <w:szCs w:val="20"/>
+              </w:rPr>
+              <w:t xml:space="preserve">Carga masiva de datos históricos, típicamente ejecutada una vez.</w:t>
+            </w:r>
+          </w:p>
+        </w:tc>
+      </w:tr>
+      <w:tr>
+        <w:tc>
+          <w:tcPr>
+            <w:tcW w:type="dxa" w:w="2400"/>
+            <w:tcBorders>
+              <w:top w:val="single" w:color="BFBFBF" w:sz="1"/>
+              <w:left w:val="single" w:color="BFBFBF" w:sz="1"/>
+              <w:bottom w:val="single" w:color="BFBFBF" w:sz="1"/>
+              <w:right w:val="single" w:color="BFBFBF" w:sz="1"/>
+            </w:tcBorders>
+            <w:shd w:fill="F7F9FC" w:val="clear"/>
+            <w:tcMar>
+              <w:top w:type="dxa" w:w="80"/>
+              <w:left w:type="dxa" w:w="120"/>
+              <w:bottom w:type="dxa" w:w="80"/>
+              <w:right w:type="dxa" w:w="120"/>
+            </w:tcMar>
+          </w:tcPr>
+          <w:p>
+            <w:r>
+              <w:rPr>
+                <w:b w:val="false"/>
+                <w:bCs w:val="false"/>
+                <w:color w:val="000000"/>
+                <w:sz w:val="20"/>
+                <w:szCs w:val="20"/>
+              </w:rPr>
+              <w:t xml:space="preserve">Volatilidad</w:t>
+            </w:r>
+          </w:p>
+        </w:tc>
+        <w:tc>
+          <w:tcPr>
+            <w:tcW w:type="dxa" w:w="6960"/>
+            <w:tcBorders>
+              <w:top w:val="single" w:color="BFBFBF" w:sz="1"/>
+              <w:left w:val="single" w:color="BFBFBF" w:sz="1"/>
+              <w:bottom w:val="single" w:color="BFBFBF" w:sz="1"/>
+              <w:right w:val="single" w:color="BFBFBF" w:sz="1"/>
+            </w:tcBorders>
+            <w:shd w:fill="F7F9FC" w:val="clear"/>
+            <w:tcMar>
+              <w:top w:type="dxa" w:w="80"/>
+              <w:left w:type="dxa" w:w="120"/>
+              <w:bottom w:type="dxa" w:w="80"/>
+              <w:right w:type="dxa" w:w="120"/>
+            </w:tcMar>
+          </w:tcPr>
+          <w:p>
+            <w:r>
+              <w:rPr>
+                <w:b w:val="false"/>
+                <w:bCs w:val="false"/>
+                <w:color w:val="000000"/>
+                <w:sz w:val="20"/>
+                <w:szCs w:val="20"/>
+              </w:rPr>
+              <w:t xml:space="preserve">Medida de qué tanto varía un precio; desviación estándar de retornos.</w:t>
+            </w:r>
+          </w:p>
+        </w:tc>
+      </w:tr>
+      <w:tr>
+        <w:tc>
+          <w:tcPr>
+            <w:tcW w:type="dxa" w:w="2400"/>
+            <w:tcBorders>
+              <w:top w:val="single" w:color="BFBFBF" w:sz="1"/>
+              <w:left w:val="single" w:color="BFBFBF" w:sz="1"/>
+              <w:bottom w:val="single" w:color="BFBFBF" w:sz="1"/>
+              <w:right w:val="single" w:color="BFBFBF" w:sz="1"/>
+            </w:tcBorders>
+            <w:shd w:fill="FFFFFF" w:val="clear"/>
+            <w:tcMar>
+              <w:top w:type="dxa" w:w="80"/>
+              <w:left w:type="dxa" w:w="120"/>
+              <w:bottom w:type="dxa" w:w="80"/>
+              <w:right w:type="dxa" w:w="120"/>
+            </w:tcMar>
+          </w:tcPr>
+          <w:p>
+            <w:r>
+              <w:rPr>
+                <w:b w:val="false"/>
+                <w:bCs w:val="false"/>
+                <w:color w:val="000000"/>
+                <w:sz w:val="20"/>
+                <w:szCs w:val="20"/>
+              </w:rPr>
               <w:t xml:space="preserve">Media móvil</w:t>
             </w:r>
           </w:p>
@@ -6854,24 +8501,24 @@
               <w:bottom w:val="single" w:color="BFBFBF" w:sz="1"/>
               <w:right w:val="single" w:color="BFBFBF" w:sz="1"/>
             </w:tcBorders>
-            <w:shd w:fill="F7F9FC" w:val="clear"/>
-            <w:tcMar>
-              <w:top w:type="dxa" w:w="80"/>
-              <w:left w:type="dxa" w:w="120"/>
-              <w:bottom w:type="dxa" w:w="80"/>
-              <w:right w:type="dxa" w:w="120"/>
-            </w:tcMar>
-          </w:tcPr>
-          <w:p>
-            <w:r>
-              <w:rPr>
-                <w:b w:val="false"/>
-                <w:bCs w:val="false"/>
-                <w:color w:val="000000"/>
-                <w:sz w:val="20"/>
-                <w:szCs w:val="20"/>
-              </w:rPr>
-              <w:t xml:space="preserve">Promedio calculado sobre una ventana de tiempo que se "desliza" día a día.</w:t>
+            <w:shd w:fill="FFFFFF" w:val="clear"/>
+            <w:tcMar>
+              <w:top w:type="dxa" w:w="80"/>
+              <w:left w:type="dxa" w:w="120"/>
+              <w:bottom w:type="dxa" w:w="80"/>
+              <w:right w:type="dxa" w:w="120"/>
+            </w:tcMar>
+          </w:tcPr>
+          <w:p>
+            <w:r>
+              <w:rPr>
+                <w:b w:val="false"/>
+                <w:bCs w:val="false"/>
+                <w:color w:val="000000"/>
+                <w:sz w:val="20"/>
+                <w:szCs w:val="20"/>
+              </w:rPr>
+              <w:t xml:space="preserve">Promedio calculado sobre una ventana de tiempo deslizante.</w:t>
             </w:r>
           </w:p>
         </w:tc>
@@ -6883,7 +8530,7 @@
         <w:spacing w:after="200" w:before="360"/>
       </w:pPr>
       <w:r>
-        <w:t xml:space="preserve">12. Preguntas frecuentes (FAQ)</w:t>
+        <w:t xml:space="preserve">15. Preguntas frecuentes (FAQ)</w:t>
       </w:r>
     </w:p>
     <w:p>
@@ -6900,7 +8547,7 @@
         <w:spacing w:after="120"/>
       </w:pPr>
       <w:r>
-        <w:t xml:space="preserve">Cero pesos. BigQuery cobra $0 hasta 10 GB de storage y 1 TB de queries al mes; este proyecto usa menos del 1% de eso. GitHub Actions es gratis ilimitado para repos públicos.</w:t>
+        <w:t xml:space="preserve">BigQuery + GitHub Actions: $0 (dentro de la capa gratuita). Anthropic API para el agente: unos centavos por uso normal. Total: prácticamente $0 mientras el uso sea personal.</w:t>
       </w:r>
     </w:p>
     <w:p>
@@ -6917,7 +8564,7 @@
         <w:spacing w:after="120"/>
       </w:pPr>
       <w:r>
-        <w:t xml:space="preserve">El pipeline fallaría en la fase de Extract y GitHub enviaría un email. La librería yfinance se actualiza rápido cuando eso pasa; bastaría con hacer pip install --upgrade yfinance y bumping el requirements.txt.</w:t>
+        <w:t xml:space="preserve">El pipeline fallaría en Extract y GitHub notificaría por email. Suele bastar con pip install --upgrade yfinance.</w:t>
       </w:r>
     </w:p>
     <w:p>
@@ -6934,7 +8581,7 @@
         <w:spacing w:after="120"/>
       </w:pPr>
       <w:r>
-        <w:t xml:space="preserve">Sí. Editas el dict TICKERS con el símbolo correcto de Yahoo (ej. ".MX" para México, ".DE" para Alemania, ".BA" para Argentina). Verifica primero que Yahoo tenga datos con python test_tickers.py.</w:t>
+        <w:t xml:space="preserve">Sí. Editas TICKERS con el sufijo Yahoo correcto (.MX, .DE, .BA, etc.) y actualizas COMPANY_META en el dashboard.</w:t>
       </w:r>
     </w:p>
     <w:p>
@@ -6951,7 +8598,7 @@
         <w:spacing w:after="120"/>
       </w:pPr>
       <w:r>
-        <w:t xml:space="preserve">No. Yahoo tiene un delay de ~15 minutos incluso en su plataforma web. Como este pipeline corre una vez al día después del cierre, los datos son "end-of-day", no live.</w:t>
+        <w:t xml:space="preserve">No. Yahoo tiene delay de ~15 min incluso en su plataforma web. El cron corre una vez al día post-cierre.</w:t>
       </w:r>
     </w:p>
     <w:p>
@@ -6960,7 +8607,7 @@
         <w:spacing w:after="120" w:before="200"/>
       </w:pPr>
       <w:r>
-        <w:t xml:space="preserve">¿Cómo consulto los datos yo mismo?</w:t>
+        <w:t xml:space="preserve">¿El agente puede inventar datos?</w:t>
       </w:r>
     </w:p>
     <w:p>
@@ -6968,7 +8615,7 @@
         <w:spacing w:after="120"/>
       </w:pPr>
       <w:r>
-        <w:t xml:space="preserve">Desde la consola de BigQuery: console.cloud.google.com/bigquery. Se pueden escribir queries SQL directamente. Para queries complejas, usar las vistas *_view que ya traen los nombres bonitos y hora Colombia.</w:t>
+        <w:t xml:space="preserve">No. Está instruido a usar solo las tools (que consultan la API real) y a decir explícitamente cuando no sabe algo. El system prompt refuerza esto.</w:t>
       </w:r>
     </w:p>
     <w:p>
@@ -6977,7 +8624,7 @@
         <w:spacing w:after="120" w:before="200"/>
       </w:pPr>
       <w:r>
-        <w:t xml:space="preserve">¿Y si quiero borrar todo?</w:t>
+        <w:t xml:space="preserve">¿Puedo cambiar el modelo del agente?</w:t>
       </w:r>
     </w:p>
     <w:p>
@@ -6985,7 +8632,24 @@
         <w:spacing w:after="120"/>
       </w:pPr>
       <w:r>
-        <w:t xml:space="preserve">Borrando el proyecto GCP entero, todos los recursos y datos desaparecen: gcloud projects delete stock-etl-lacabrita. El repo de GitHub se puede borrar aparte.</w:t>
+        <w:t xml:space="preserve">Sí. Exporta CLAUDE_MODEL=claude-haiku-4-5-20251001 antes de correr Streamlit, o cambia el default en chat_agent.py.</w:t>
+      </w:r>
+    </w:p>
+    <w:p>
+      <w:pPr>
+        <w:pStyle w:val="Heading3"/>
+        <w:spacing w:after="120" w:before="200"/>
+      </w:pPr>
+      <w:r>
+        <w:t xml:space="preserve">¿La API y el dashboard son accesibles desde internet?</w:t>
+      </w:r>
+    </w:p>
+    <w:p>
+      <w:pPr>
+        <w:spacing w:after="120"/>
+      </w:pPr>
+      <w:r>
+        <w:t xml:space="preserve">En este momento solo desde tu Mac (localhost). Para exponerlos públicamente se despliegan en Cloud Run (API) y Streamlit Community Cloud (dashboard). Ese es el siguiente paso del roadmap.</w:t>
       </w:r>
     </w:p>
     <w:p>
@@ -6994,7 +8658,7 @@
         <w:spacing w:after="200" w:before="360"/>
       </w:pPr>
       <w:r>
-        <w:t xml:space="preserve">13. Roadmap</w:t>
+        <w:t xml:space="preserve">16. Roadmap</w:t>
       </w:r>
     </w:p>
     <w:p>
@@ -7002,7 +8666,7 @@
         <w:spacing w:after="120"/>
       </w:pPr>
       <w:r>
-        <w:t xml:space="preserve">Etapas cumplidas y siguientes fases planeadas:</w:t>
+        <w:t xml:space="preserve">Etapas cumplidas y próximas fases:</w:t>
       </w:r>
     </w:p>
     <w:p>
@@ -7015,7 +8679,7 @@
         <w:spacing w:after="60"/>
       </w:pPr>
       <w:r>
-        <w:t xml:space="preserve">[✓] Pipeline mínimo con un solo ticker.</w:t>
+        <w:t xml:space="preserve">[✓] Pipeline mínimo con un ticker.</w:t>
       </w:r>
     </w:p>
     <w:p>
@@ -7028,7 +8692,7 @@
         <w:spacing w:after="60"/>
       </w:pPr>
       <w:r>
-        <w:t xml:space="preserve">[✓] Multi-ticker + tabla dimensional.</w:t>
+        <w:t xml:space="preserve">[✓] Multi-ticker (30) + tabla dimensional con parent_brand.</w:t>
       </w:r>
     </w:p>
     <w:p>
@@ -7106,7 +8770,7 @@
         <w:spacing w:after="60"/>
       </w:pPr>
       <w:r>
-        <w:t xml:space="preserve">[  ] API REST con FastAPI que exponga las tablas.</w:t>
+        <w:t xml:space="preserve">[✓] API REST con FastAPI (7 endpoints + Swagger).</w:t>
       </w:r>
     </w:p>
     <w:p>
@@ -7119,7 +8783,7 @@
         <w:spacing w:after="60"/>
       </w:pPr>
       <w:r>
-        <w:t xml:space="preserve">[  ] Dashboard interactivo con Streamlit.</w:t>
+        <w:t xml:space="preserve">[✓] Dashboard interactivo con Streamlit.</w:t>
       </w:r>
     </w:p>
     <w:p>
@@ -7132,7 +8796,7 @@
         <w:spacing w:after="60"/>
       </w:pPr>
       <w:r>
-        <w:t xml:space="preserve">[  ] Agente conversacional (LLM + function calling).</w:t>
+        <w:t xml:space="preserve">[✓] Agente conversacional con Claude y tool use.</w:t>
       </w:r>
     </w:p>
     <w:p>
@@ -7145,7 +8809,7 @@
         <w:spacing w:after="60"/>
       </w:pPr>
       <w:r>
-        <w:t xml:space="preserve">[  ] Data quality checks automáticos (Great Expectations).</w:t>
+        <w:t xml:space="preserve">[ ] Deploy: API en Cloud Run + Dashboard en Streamlit Community Cloud.</w:t>
       </w:r>
     </w:p>
     <w:p>
@@ -7158,7 +8822,20 @@
         <w:spacing w:after="60"/>
       </w:pPr>
       <w:r>
-        <w:t xml:space="preserve">[  ] Notificaciones por Slack/Telegram cuando el pipeline falle.</w:t>
+        <w:t xml:space="preserve">[ ] Alertas por Slack/email cuando el pipeline falla o hay movimientos anómalos.</w:t>
+      </w:r>
+    </w:p>
+    <w:p>
+      <w:pPr>
+        <w:pStyle w:val="ListParagraph"/>
+        <w:numPr>
+          <w:ilvl w:val="0"/>
+          <w:numId w:val="2"/>
+        </w:numPr>
+        <w:spacing w:after="60"/>
+      </w:pPr>
+      <w:r>
+        <w:t xml:space="preserve">[ ] Tests automáticos (pytest) + calidad de datos (great_expectations).</w:t>
       </w:r>
     </w:p>
     <w:sectPr>
@@ -7292,7 +8969,7 @@
         <w:sz w:val="18"/>
         <w:szCs w:val="18"/>
       </w:rPr>
-      <w:t xml:space="preserve">Stock Market ETL Pipeline — Documentación</w:t>
+      <w:t xml:space="preserve">Stock Market ETL Pipeline — Documentación v2</w:t>
     </w:r>
   </w:p>
 </w:hdr>

</xml_diff>